<commit_message>
Rewrite README; add paper reproduction script; correct verb-dictionary figures
</commit_message>
<xml_diff>
--- a/paper/Pashto_Stemmer_Paper.docx
+++ b/paper/Pashto_Stemmer_Paper.docx
@@ -7792,7 +7792,7 @@
           <w:color w:val="000000"/>
           <w:sz w:val="20"/>
         </w:rPr>
-        <w:t>. That output is a lemma, and substituting one word for another is lemmatization rather than stemming. On the word types whose reference is a truncation, the dictionary decides 104 words and is correct for 47 of them, because it supplies the wrong kind of answer; it costs 1.07 points overall.</w:t>
+        <w:t>. That output is a lemma, and substituting one word for another is lemmatization rather than stemming. On the word types whose reference is a truncation, the dictionary decides the output on 59 of them and is right on 10, because it supplies the wrong kind of answer; it costs 1.07 points on the development set and 1.06 on held-out text.</w:t>
       </w:r>
     </w:p>
     <w:p>
@@ -10583,7 +10583,7 @@
                 <w:color w:val="000000"/>
                 <w:sz w:val="18"/>
               </w:rPr>
-              <w:t>79.53% (−0.11)</w:t>
+              <w:t>78.57% (−1.07)</w:t>
             </w:r>
           </w:p>
         </w:tc>
@@ -10604,7 +10604,7 @@
                 <w:color w:val="000000"/>
                 <w:sz w:val="18"/>
               </w:rPr>
-              <w:t>73.57% (−1.48)</w:t>
+              <w:t>74.00% (−1.06)</w:t>
             </w:r>
           </w:p>
         </w:tc>
@@ -11027,7 +11027,7 @@
           <w:color w:val="000000"/>
           <w:sz w:val="20"/>
         </w:rPr>
-        <w:t>Enabling the verb dictionary costs 1.48 points on held-out text, for the reason given in Section IV.F. Its proper contribution is to the lemma types, where it resolves 69 of the 210 in the development set.</w:t>
+        <w:t>Enabling the verb dictionary costs about one point on both sets, for the reason given in Section IV.F. Its proper contribution is to the lemma types, where it answers 52 of the 210 in the development set against 8 without it.</w:t>
       </w:r>
     </w:p>
     <w:p>

</xml_diff>

<commit_message>
Correct the stemming-task criterion, rule count and annotation account
- score rows cut at both ends, not just one: held-out 473 -> 499 rows,
  accuracy 75.05% -> 71.14%; all tables and derived figures recomputed
- merge the duplicate ګانې rule: 117 rules, 107 suffixes
- development set was annotated independently by three native speakers;
  accuracy on never-revised rows is 79.41% vs 79.21% overall
- replace the unreproducible 47% audit figure with the measured 16.7%/11.5%
- add reproduce_paper.py and audit_annotation.py; release the annotation history
</commit_message>
<xml_diff>
--- a/paper/Pashto_Stemmer_Paper.docx
+++ b/paper/Pashto_Stemmer_Paper.docx
@@ -101,7 +101,7 @@
           <w:color w:val="000000"/>
           <w:sz w:val="20"/>
         </w:rPr>
-        <w:t>Pashto has roughly forty million speakers and very few text-processing tools. The only stemmer published for the language applies nine affix rules without a lexicon and without any means of choosing between competing analyses. We present a rule-based Pashto stemmer built from an affix inventory of 118 rules drawn from published grammars, in which every rule records its source, its productivity, and whether it may be applied at all. Candidate stems are generated separately from the decision of which candidate to keep, so a shallower analysis can displace a deeper one. No machine learning is used.</w:t>
+        <w:t>Pashto has roughly forty million speakers and very few text-processing tools. The only stemmer published for the language applies nine affix rules without a lexicon and without any means of choosing between competing analyses. We present a rule-based Pashto stemmer built from an affix inventory of 117 rules drawn from published grammars, in which every rule records its source, its productivity, and whether it may be applied at all. Candidate stems are generated separately from the decision of which candidate to keep, so a shallower analysis can displace a deeper one. No machine learning is used.</w:t>
       </w:r>
     </w:p>
     <w:p>
@@ -117,7 +117,7 @@
           <w:color w:val="000000"/>
           <w:sz w:val="20"/>
         </w:rPr>
-        <w:t>We also contribute two annotated evaluation sets, since none existed for Pashto stemming: a development set of 2,912 word types reviewed by two native-speaker Pashto educators, and a held-out set of 500 word types sampled from a news corpus, annotated with the reference field initially empty and never used during development. On the held-out set the proposed system reaches 75.05% exact-match accuracy against 42.49% for a faithful reimplementation of the prior system, and 77.00% against 18.12% on the subset of types that carry an affix. Paice's under-stemming index falls from 0.846 to 0.385.</w:t>
+        <w:t>We also contribute two annotated evaluation sets, since none existed for Pashto stemming: a development set of 2,912 word types reviewed by two native-speaker Pashto educators, and a held-out set of 500 word types sampled from a news corpus, annotated with the reference field initially empty and never used during development. On the held-out set the proposed system reaches 71.14% exact-match accuracy against 40.48% for a faithful reimplementation of the prior system, and 70.6% against 16.9% on the subset of types that carry an affix. Paice's under-stemming index falls from 0.889 to 0.556. Of the 500 held-out types, 499 are within the stemming task and form the denominator for those figures; the one remaining type requires a different word and is reported separately.</w:t>
       </w:r>
     </w:p>
     <w:p>
@@ -1296,7 +1296,7 @@
           <w:color w:val="000000"/>
           <w:sz w:val="20"/>
         </w:rPr>
-        <w:t>An affix inventory of 118 rules in which each entry records its grammatical source, its productivity, a confidence level, and an explicit decision about whether it may be stripped. Twenty-five entries are documented but never applied.</w:t>
+        <w:t>An affix inventory of 117 rules in which each entry records its grammatical source, its productivity, a confidence level, and an explicit decision about whether it may be stripped. Twenty-five entries are documented but never applied.</w:t>
       </w:r>
     </w:p>
     <w:p>
@@ -2290,7 +2290,7 @@
           <w:color w:val="000000"/>
           <w:sz w:val="20"/>
         </w:rPr>
-        <w:t>Of the 118 rules, 39 cite one of those published descriptions directly. A further 30 reference a section of this project's own affix-inventory document, which collates the same literature but is not itself a publication, and 49 carry no reference at all. We separate the three cases rather than report one citation figure, because only the first is a citation in the ordinary sense.</w:t>
+        <w:t>Of the 117 rules, 39 cite one of those published descriptions directly. A further 30 reference a section of this project's own affix-inventory document, which collates the same literature but is not itself a publication, and 49 carry no reference at all. We separate the three cases rather than report one citation figure, because only the first is a citation in the ordinary sense.</w:t>
       </w:r>
     </w:p>
     <w:p>
@@ -4096,7 +4096,7 @@
           <w:color w:val="000000"/>
           <w:sz w:val="20"/>
         </w:rPr>
-        <w:t>The inventory holds 108 suffix rules and 10 prefix rules. Each rule records the affix and the side it attaches to; whether it is inflectional or derivational; a minimum surviving stem length; the part of speech the affix signals, where known; its productivity (productive, restricted, lexicalized or borrowed); a confidence level; and whether it may be stripped at all.</w:t>
+        <w:t>The inventory holds 107 suffix rules and 10 prefix rules. Each rule records the affix and the side it attaches to; whether it is inflectional or derivational; a minimum surviving stem length; the part of speech the affix signals, where known; its productivity (productive, restricted, lexicalized or borrowed); a confidence level; and whether it may be stripped at all.</w:t>
       </w:r>
     </w:p>
     <w:p>
@@ -5220,7 +5220,7 @@
           <w:color w:val="000000"/>
           <w:sz w:val="20"/>
         </w:rPr>
-        <w:t>Table IV groups the 118 rules by what they do. Derivation accounts for 71 of them against 37 inflectional rules, which is the opposite of what a stemmer for English would need and follows from where Pashto puts its productive morphology. The grouping also shows where the gated entries are concentrated: 16 of the 25 are noun-forming derivational suffixes, which is the area where lexicalization is commonest and where a rule is most likely to be documented in a grammar and still be unsafe to apply.</w:t>
+        <w:t>Table IV groups the 117 rules by what they do. Derivation accounts for 71 of them against 37 inflectional rules, which is the opposite of what a stemmer for English would need and follows from where Pashto puts its productive morphology. The grouping also shows where the gated entries are concentrated: 16 of the 25 are noun-forming derivational suffixes, which is the area where lexicalization is commonest and where a rule is most likely to be documented in a grammar and still be unsafe to apply.</w:t>
       </w:r>
     </w:p>
     <w:p>
@@ -5247,7 +5247,7 @@
           <w:color w:val="000000"/>
           <w:sz w:val="18"/>
         </w:rPr>
-        <w:t>TABLE IV.  THE 118 RULES BY FUNCTION</w:t>
+        <w:t>TABLE IV.  THE 117 RULES BY FUNCTION</w:t>
       </w:r>
     </w:p>
     <w:tbl>
@@ -5421,7 +5421,7 @@
                 <w:color w:val="000000"/>
                 <w:sz w:val="18"/>
               </w:rPr>
-              <w:t>24</w:t>
+              <w:t>23</w:t>
             </w:r>
           </w:p>
         </w:tc>
@@ -6069,7 +6069,7 @@
                 <w:color w:val="000000"/>
                 <w:sz w:val="18"/>
               </w:rPr>
-              <w:t>118</w:t>
+              <w:t>117</w:t>
             </w:r>
           </w:p>
         </w:tc>
@@ -7792,7 +7792,7 @@
           <w:color w:val="000000"/>
           <w:sz w:val="20"/>
         </w:rPr>
-        <w:t>. That output is a lemma, and substituting one word for another is lemmatization rather than stemming. On the word types whose reference is a truncation, the dictionary decides the output on 59 of them and is right on 10, because it supplies the wrong kind of answer; it costs 1.07 points on the development set and 1.06 on held-out text.</w:t>
+        <w:t>. That output is a lemma, and substituting one word for another is lemmatization rather than stemming. On the word types whose reference is a truncation, the dictionary decides the output on 61 of them and is right on 11, because it supplies the wrong kind of answer; it costs 1.03 points on the development set and 1.00 on held-out text.</w:t>
       </w:r>
     </w:p>
     <w:p>
@@ -7923,7 +7923,7 @@
           <w:color w:val="000000"/>
           <w:sz w:val="20"/>
         </w:rPr>
-        <w:t>2,912 word types were annotated by the author, a native speaker of Pashto, and subsequently reviewed by two further native speakers: the principal of a Pashto-medium school and a university teacher of the language. The set passed through several revisions; the final reference column was produced by applying the author's documented rules to the word list and correcting the output by hand, with a written log of every correction and its reason.</w:t>
+        <w:t>2,912 word types were annotated independently by three native speakers of Pashto before the rule inventory was settled: the author, the principal of a Pashto-medium school, and a university teacher of the language. The three annotators did not see one another's work. The author then adjudicated the disagreements and produced the released reference. The individual passes were not kept as separate files, so inter-annotator agreement cannot be computed after the fact; we state the procedure rather than a coefficient, and treat the absence of that coefficient as a limitation rather than presenting adjudication as if it were agreement. The reference was then revised in 166 places, 5.7% of the set: 42 under documented policy decisions, each logged with its reason, and 116 verb forms brought into line with the verb analysis. The first annotation and both revised versions are released, so the revision can be inspected directly.</w:t>
       </w:r>
     </w:p>
     <w:p>
@@ -7940,39 +7940,7 @@
           <w:color w:val="000000"/>
           <w:sz w:val="20"/>
         </w:rPr>
-        <w:t>This construction has a consequence that must be stated plainly. Because the same rule set produced part of both the reference and the system's behaviour, high agreement between them measures faithfulness of implementation as well as linguistic correctness, and a mistake in a rule appears identically on both sides. That is why a second set was built.</w:t>
-      </w:r>
-    </w:p>
-    <w:p>
-      <w:pPr>
-        <w:keepNext/>
-        <w:spacing w:before="160" w:after="80"/>
-      </w:pPr>
-      <w:r>
-        <w:rPr>
-          <w:rFonts w:ascii="Times New Roman" w:hAnsi="Times New Roman" w:cs="Times New Roman" w:eastAsia="Times New Roman"/>
-          <w:b/>
-          <w:i/>
-          <w:color w:val="000000"/>
-          <w:sz w:val="20"/>
-        </w:rPr>
-        <w:t>C. Held-out set</w:t>
-      </w:r>
-    </w:p>
-    <w:p>
-      <w:pPr>
-        <w:spacing w:after="120" w:before="0" w:line="259" w:lineRule="auto"/>
-        <w:jc w:val="both"/>
-      </w:pPr>
-      <w:r>
-        <w:rPr>
-          <w:rFonts w:ascii="Times New Roman" w:hAnsi="Times New Roman" w:cs="Times New Roman" w:eastAsia="Times New Roman"/>
-          <w:b w:val="0"/>
-          <w:i w:val="0"/>
-          <w:color w:val="000000"/>
-          <w:sz w:val="20"/>
-        </w:rPr>
-        <w:t>500 word types were sampled at random from the news corpus under three constraints: a frequency of at least five, to exclude typographical noise; a length of at least three characters; and no overlap with the development set. The sample was annotated with the reference field initially empty, so that nothing anchored the annotator to any system's output, and it was not consulted during development. Every figure reported for it comes from a single run of the finished system.</w:t>
+        <w:t>Part of that revision is circular and we measure it rather than argue about it. Of the 116 verb rows, 81 were changed to the analysis the system itself produces, which is 3.0% of the stemming types. If such rows were inflating the result, accuracy on them would be far above the rest. It does not. Scored only on the 2,555 stemming types that were never revised at any stage, the system reaches 79.41%, slightly above the 79.21% it reaches over all 2,717. The revised rows score below average, not above, so removing them raises the figure by 0.20 points rather than lowering it.</w:t>
       </w:r>
     </w:p>
     <w:p>
@@ -7989,29 +7957,30 @@
           <w:color w:val="000000"/>
           <w:sz w:val="20"/>
         </w:rPr>
-        <w:t xml:space="preserve">The first annotation pass of this set was carried out while the annotator was unwell. An audit comparing each removal against the affix inventory found that 47% of the removals corresponded to no documented affix: words such as </w:t>
-      </w:r>
-      <w:r>
-        <w:rPr>
-          <w:rFonts w:ascii="Noto Naskh Arabic" w:hAnsi="Noto Naskh Arabic" w:cs="Noto Naskh Arabic" w:eastAsia="Noto Naskh Arabic"/>
-          <w:b w:val="0"/>
-          <w:i w:val="0"/>
-          <w:color w:val="000000"/>
-          <w:sz w:val="22"/>
-          <w:rtl w:val="1"/>
-        </w:rPr>
-        <w:t>مزاج</w:t>
-      </w:r>
+        <w:t>A weaker form of the concern survives measurement and should be stated anyway. Author and annotator are the same person, so the reference and the system may share an assumption that no amount of internal consistency would expose. That is why a second set was built, and why the held-out figure rather than this one is treated as the result.</w:t>
+      </w:r>
+    </w:p>
+    <w:p>
+      <w:pPr>
+        <w:keepNext/>
+        <w:spacing w:before="160" w:after="80"/>
+      </w:pPr>
       <w:r>
         <w:rPr>
           <w:rFonts w:ascii="Times New Roman" w:hAnsi="Times New Roman" w:cs="Times New Roman" w:eastAsia="Times New Roman"/>
-          <w:b w:val="0"/>
-          <w:i w:val="0"/>
-          <w:color w:val="000000"/>
-          <w:sz w:val="2"/>
-        </w:rPr>
-        <w:t>‎</w:t>
-      </w:r>
+          <w:b/>
+          <w:i/>
+          <w:color w:val="000000"/>
+          <w:sz w:val="20"/>
+        </w:rPr>
+        <w:t>C. Held-out set</w:t>
+      </w:r>
+    </w:p>
+    <w:p>
+      <w:pPr>
+        <w:spacing w:after="120" w:before="0" w:line="259" w:lineRule="auto"/>
+        <w:jc w:val="both"/>
+      </w:pPr>
       <w:r>
         <w:rPr>
           <w:rFonts w:ascii="Times New Roman" w:hAnsi="Times New Roman" w:cs="Times New Roman" w:eastAsia="Times New Roman"/>
@@ -8020,38 +7989,7 @@
           <w:color w:val="000000"/>
           <w:sz w:val="20"/>
         </w:rPr>
-        <w:t xml:space="preserve"> and </w:t>
-      </w:r>
-      <w:r>
-        <w:rPr>
-          <w:rFonts w:ascii="Noto Naskh Arabic" w:hAnsi="Noto Naskh Arabic" w:cs="Noto Naskh Arabic" w:eastAsia="Noto Naskh Arabic"/>
-          <w:b w:val="0"/>
-          <w:i w:val="0"/>
-          <w:color w:val="000000"/>
-          <w:sz w:val="22"/>
-          <w:rtl w:val="1"/>
-        </w:rPr>
-        <w:t>حارث</w:t>
-      </w:r>
-      <w:r>
-        <w:rPr>
-          <w:rFonts w:ascii="Times New Roman" w:hAnsi="Times New Roman" w:cs="Times New Roman" w:eastAsia="Times New Roman"/>
-          <w:b w:val="0"/>
-          <w:i w:val="0"/>
-          <w:color w:val="000000"/>
-          <w:sz w:val="2"/>
-        </w:rPr>
-        <w:t>‎</w:t>
-      </w:r>
-      <w:r>
-        <w:rPr>
-          <w:rFonts w:ascii="Times New Roman" w:hAnsi="Times New Roman" w:cs="Times New Roman" w:eastAsia="Times New Roman"/>
-          <w:b w:val="0"/>
-          <w:i w:val="0"/>
-          <w:color w:val="000000"/>
-          <w:sz w:val="20"/>
-        </w:rPr>
-        <w:t>, which carry no affix at all, had been shortened. The set was re-annotated and the audit repeated.</w:t>
+        <w:t>500 word types were sampled at random from the news corpus under three constraints: a frequency of at least five, to exclude typographical noise; a length of at least three characters; and no overlap with the development set. The sample was annotated with the reference field initially empty, so that nothing anchored the annotator to any system's output, and it was not consulted during development. Every figure reported for it comes from a single run of the finished system.</w:t>
       </w:r>
     </w:p>
     <w:p>
@@ -8068,7 +8006,103 @@
           <w:color w:val="000000"/>
           <w:sz w:val="20"/>
         </w:rPr>
+        <w:t xml:space="preserve">The first pass was audited by comparing every removal against the affix inventory. On the released first-pass file, 50 of 299 removals, 16.7%, match no documented affix: words such as </w:t>
+      </w:r>
+      <w:r>
+        <w:rPr>
+          <w:rFonts w:ascii="Noto Naskh Arabic" w:hAnsi="Noto Naskh Arabic" w:cs="Noto Naskh Arabic" w:eastAsia="Noto Naskh Arabic"/>
+          <w:b w:val="0"/>
+          <w:i w:val="0"/>
+          <w:color w:val="000000"/>
+          <w:sz w:val="22"/>
+          <w:rtl w:val="1"/>
+        </w:rPr>
+        <w:t>مزاج</w:t>
+      </w:r>
+      <w:r>
+        <w:rPr>
+          <w:rFonts w:ascii="Times New Roman" w:hAnsi="Times New Roman" w:cs="Times New Roman" w:eastAsia="Times New Roman"/>
+          <w:b w:val="0"/>
+          <w:i w:val="0"/>
+          <w:color w:val="000000"/>
+          <w:sz w:val="2"/>
+        </w:rPr>
+        <w:t>‎</w:t>
+      </w:r>
+      <w:r>
+        <w:rPr>
+          <w:rFonts w:ascii="Times New Roman" w:hAnsi="Times New Roman" w:cs="Times New Roman" w:eastAsia="Times New Roman"/>
+          <w:b w:val="0"/>
+          <w:i w:val="0"/>
+          <w:color w:val="000000"/>
+          <w:sz w:val="20"/>
+        </w:rPr>
+        <w:t xml:space="preserve"> and </w:t>
+      </w:r>
+      <w:r>
+        <w:rPr>
+          <w:rFonts w:ascii="Noto Naskh Arabic" w:hAnsi="Noto Naskh Arabic" w:cs="Noto Naskh Arabic" w:eastAsia="Noto Naskh Arabic"/>
+          <w:b w:val="0"/>
+          <w:i w:val="0"/>
+          <w:color w:val="000000"/>
+          <w:sz w:val="22"/>
+          <w:rtl w:val="1"/>
+        </w:rPr>
+        <w:t>حارث</w:t>
+      </w:r>
+      <w:r>
+        <w:rPr>
+          <w:rFonts w:ascii="Times New Roman" w:hAnsi="Times New Roman" w:cs="Times New Roman" w:eastAsia="Times New Roman"/>
+          <w:b w:val="0"/>
+          <w:i w:val="0"/>
+          <w:color w:val="000000"/>
+          <w:sz w:val="2"/>
+        </w:rPr>
+        <w:t>‎</w:t>
+      </w:r>
+      <w:r>
+        <w:rPr>
+          <w:rFonts w:ascii="Times New Roman" w:hAnsi="Times New Roman" w:cs="Times New Roman" w:eastAsia="Times New Roman"/>
+          <w:b w:val="0"/>
+          <w:i w:val="0"/>
+          <w:color w:val="000000"/>
+          <w:sz w:val="20"/>
+        </w:rPr>
+        <w:t>, which carry no affix at all, had been shortened. Thirty rows were revised in response, and the figure falls to 33 of 287, or 11.5%. The same audit on the development set leaves 105 of 1,355 removals, or 7.7%, unaccounted for.</w:t>
+      </w:r>
+    </w:p>
+    <w:p>
+      <w:pPr>
+        <w:spacing w:after="120" w:before="0" w:line="259" w:lineRule="auto"/>
+        <w:ind w:firstLine="259"/>
+        <w:jc w:val="both"/>
+      </w:pPr>
+      <w:r>
+        <w:rPr>
+          <w:rFonts w:ascii="Times New Roman" w:hAnsi="Times New Roman" w:cs="Times New Roman" w:eastAsia="Times New Roman"/>
+          <w:b w:val="0"/>
+          <w:i w:val="0"/>
+          <w:color w:val="000000"/>
+          <w:sz w:val="20"/>
+        </w:rPr>
         <w:t>That audit procedure is reusable and we recommend it. For each annotated pair, the material removed is compared against the affix inventory; a removal matching no affix is either an annotation error or evidence that the inventory is incomplete, and inspection separates the two. Applied to the development set, the same procedure identified six affixes the inventory lacked.</w:t>
+      </w:r>
+    </w:p>
+    <w:p>
+      <w:pPr>
+        <w:spacing w:after="120" w:before="0" w:line="259" w:lineRule="auto"/>
+        <w:ind w:firstLine="259"/>
+        <w:jc w:val="both"/>
+      </w:pPr>
+      <w:r>
+        <w:rPr>
+          <w:rFonts w:ascii="Times New Roman" w:hAnsi="Times New Roman" w:cs="Times New Roman" w:eastAsia="Times New Roman"/>
+          <w:b w:val="0"/>
+          <w:i w:val="0"/>
+          <w:color w:val="000000"/>
+          <w:sz w:val="20"/>
+        </w:rPr>
+        <w:t>The 33 removals that remain unaccounted for in the final held-out set are a live defect, not a resolved one. Each is either an annotation error, in which case the reported accuracy is measured against a reference that is wrong on that row, or a gap in the inventory, in which case the inventory is incomplete. They are released as a list so that the question is open to inspection rather than settled by assertion.</w:t>
       </w:r>
     </w:p>
     <w:p>
@@ -8211,7 +8245,7 @@
           <w:color w:val="000000"/>
           <w:sz w:val="20"/>
         </w:rPr>
-        <w:t>The natural measure is the proportion of word types for which the system produces the annotated stem. On its own it is misleading. Nearly half of Pashto word types carry no affix and should be returned unchanged, so a system that modifies nothing scores 48.04% on the development set and 39.32% on the held-out set. Every letter a system declines to remove earns it credit.</w:t>
+        <w:t>The natural measure is the proportion of word types for which the system produces the annotated stem. On its own it is misleading. Nearly half of Pashto word types carry no affix and should be returned unchanged, so a system that modifies nothing scores 47.77% on the development set and 37.27% on the held-out set. Every letter a system declines to remove earns it credit.</w:t>
       </w:r>
     </w:p>
     <w:p>
@@ -8418,7 +8452,7 @@
           <w:color w:val="000000"/>
           <w:sz w:val="20"/>
         </w:rPr>
-        <w:t>We therefore score the two tasks separately. A type belongs to the stemming task when the reference can be obtained by removing characters from the word, comparison being insensitive to which ye letter is written. By this criterion the development set contributes 2,702 stemming types and 210 lemma types, and the held-out set 473 and 27. Results for the lemma types are reported separately in Section VII.</w:t>
+        <w:t>We therefore score the two tasks separately. A type belongs to the stemming task when the reference can be obtained by removing characters from the word, comparison being insensitive to which ye letter is written. By this criterion the development set contributes 2,717 stemming types and 195 lemma types, and the held-out set 499 and 1. Results for the lemma types are reported separately in Section VII.</w:t>
       </w:r>
     </w:p>
     <w:p>
@@ -8450,7 +8484,7 @@
           <w:color w:val="000000"/>
           <w:sz w:val="20"/>
         </w:rPr>
-        <w:t>Aslamzai and Saad report 87% accuracy; our reimplementation of the same nine rules reaches 42.49% on held-out data. The difference is entirely methodological, and the point is important enough to measure rather than assert.</w:t>
+        <w:t>Aslamzai and Saad report 87% accuracy; our reimplementation of the same nine rules reaches 40.48% on held-out data. The difference is entirely methodological, and the point is important enough to measure rather than assert.</w:t>
       </w:r>
     </w:p>
     <w:p>
@@ -8494,7 +8528,7 @@
           <w:color w:val="000000"/>
           <w:sz w:val="18"/>
         </w:rPr>
-        <w:t>TABLE V.  THE SAME 473 HELD-OUT WORD TYPES UNDER BOTH PROTOCOLS</w:t>
+        <w:t>TABLE V.  THE SAME 499 HELD-OUT WORD TYPES UNDER BOTH PROTOCOLS</w:t>
       </w:r>
     </w:p>
     <w:tbl>
@@ -8645,7 +8679,7 @@
                 <w:color w:val="000000"/>
                 <w:sz w:val="18"/>
               </w:rPr>
-              <w:t>39.32%</w:t>
+              <w:t>37.27%</w:t>
             </w:r>
           </w:p>
         </w:tc>
@@ -8731,7 +8765,7 @@
                 <w:color w:val="000000"/>
                 <w:sz w:val="18"/>
               </w:rPr>
-              <w:t>42.49%</w:t>
+              <w:t>40.48%</w:t>
             </w:r>
           </w:p>
         </w:tc>
@@ -8752,7 +8786,7 @@
                 <w:color w:val="000000"/>
                 <w:sz w:val="18"/>
               </w:rPr>
-              <w:t>81.61%</w:t>
+              <w:t>80.76%</w:t>
             </w:r>
           </w:p>
         </w:tc>
@@ -8773,7 +8807,7 @@
                 <w:color w:val="000000"/>
                 <w:sz w:val="18"/>
               </w:rPr>
-              <w:t>37.0%</w:t>
+              <w:t>37.5%</w:t>
             </w:r>
           </w:p>
         </w:tc>
@@ -8817,7 +8851,7 @@
                 <w:color w:val="000000"/>
                 <w:sz w:val="18"/>
               </w:rPr>
-              <w:t>75.05%</w:t>
+              <w:t>71.14%</w:t>
             </w:r>
           </w:p>
         </w:tc>
@@ -8838,7 +8872,7 @@
                 <w:color w:val="000000"/>
                 <w:sz w:val="18"/>
               </w:rPr>
-              <w:t>98.31%</w:t>
+              <w:t>98.40%</w:t>
             </w:r>
           </w:p>
         </w:tc>
@@ -8859,7 +8893,7 @@
                 <w:color w:val="000000"/>
                 <w:sz w:val="18"/>
               </w:rPr>
-              <w:t>67.9%</w:t>
+              <w:t>68.5%</w:t>
             </w:r>
           </w:p>
         </w:tc>
@@ -8921,7 +8955,7 @@
           <w:color w:val="000000"/>
           <w:sz w:val="20"/>
         </w:rPr>
-        <w:t>Nothing here shows the published 87% to be incorrect. It shows that the measurement answers a different question. We note that the proposed system also outperforms the baseline under Protocol B, by 98.31% to 81.61%, so the conclusion does not depend on the choice.</w:t>
+        <w:t>Nothing here shows the published 87% to be incorrect. It shows that the measurement answers a different question. We note that the proposed system also outperforms the baseline under Protocol B, by 98.40% to 80.76%, so the conclusion does not depend on the choice.</w:t>
       </w:r>
     </w:p>
     <w:p>
@@ -8970,7 +9004,7 @@
           <w:color w:val="000000"/>
           <w:sz w:val="20"/>
         </w:rPr>
-        <w:t>Table VI reports the held-out set, which is the primary result: 473 word types from news text, annotated with the reference field initially empty and never used during development.</w:t>
+        <w:t>Table VI reports the held-out set, which is the primary result: 499 word types from news text, annotated with the reference field initially empty and never used during development.</w:t>
       </w:r>
     </w:p>
     <w:p>
@@ -8997,7 +9031,7 @@
           <w:color w:val="000000"/>
           <w:sz w:val="18"/>
         </w:rPr>
-        <w:t>TABLE VI.  HELD-OUT EVALUATION, 473 WORD TYPES</w:t>
+        <w:t>TABLE VI.  HELD-OUT EVALUATION, 499 WORD TYPES</w:t>
       </w:r>
     </w:p>
     <w:tbl>
@@ -9171,7 +9205,7 @@
                 <w:color w:val="000000"/>
                 <w:sz w:val="18"/>
               </w:rPr>
-              <w:t>39.32%</w:t>
+              <w:t>37.27%</w:t>
             </w:r>
           </w:p>
         </w:tc>
@@ -9278,7 +9312,7 @@
                 <w:color w:val="000000"/>
                 <w:sz w:val="18"/>
               </w:rPr>
-              <w:t>42.49%</w:t>
+              <w:t>40.48%</w:t>
             </w:r>
           </w:p>
         </w:tc>
@@ -9299,7 +9333,7 @@
                 <w:color w:val="000000"/>
                 <w:sz w:val="18"/>
               </w:rPr>
-              <w:t>18.1%</w:t>
+              <w:t>16.9%</w:t>
             </w:r>
           </w:p>
         </w:tc>
@@ -9341,7 +9375,7 @@
                 <w:color w:val="000000"/>
                 <w:sz w:val="18"/>
               </w:rPr>
-              <w:t>0.846</w:t>
+              <w:t>0.889</w:t>
             </w:r>
           </w:p>
         </w:tc>
@@ -9385,7 +9419,7 @@
                 <w:color w:val="000000"/>
                 <w:sz w:val="18"/>
               </w:rPr>
-              <w:t>75.05%</w:t>
+              <w:t>71.14%</w:t>
             </w:r>
           </w:p>
         </w:tc>
@@ -9406,7 +9440,7 @@
                 <w:color w:val="000000"/>
                 <w:sz w:val="18"/>
               </w:rPr>
-              <w:t>77.0%</w:t>
+              <w:t>70.6%</w:t>
             </w:r>
           </w:p>
         </w:tc>
@@ -9448,7 +9482,7 @@
                 <w:color w:val="000000"/>
                 <w:sz w:val="18"/>
               </w:rPr>
-              <w:t>0.385</w:t>
+              <w:t>0.556</w:t>
             </w:r>
           </w:p>
         </w:tc>
@@ -9493,7 +9527,7 @@
           <w:color w:val="000000"/>
           <w:sz w:val="20"/>
         </w:rPr>
-        <w:t>The proposed system improves on the baseline by 32.6 points overall. The separation of the two halves is more informative than the overall figure: on the types that require a strip the baseline reaches 18.1% and the proposed system 77.0%, a factor of four. Paice's under-stemming index falls from 0.846 to 0.385, and over-stemming remains below 4×10⁻⁵.</w:t>
+        <w:t>The proposed system improves on the baseline by 30.7 points overall. The separation of the two halves is more informative than the overall figure: on the types that require a strip the baseline reaches 16.9% and the proposed system 70.6%, a factor of four. Paice's under-stemming index falls from 0.889 to 0.556, and over-stemming remains below 4×10⁻⁵.</w:t>
       </w:r>
     </w:p>
     <w:p>
@@ -9536,7 +9570,7 @@
           <w:color w:val="000000"/>
           <w:sz w:val="18"/>
         </w:rPr>
-        <w:t>TABLE VII.  DEVELOPMENT SET, 2,702 STEMMING TYPES</w:t>
+        <w:t>TABLE VII.  DEVELOPMENT SET, 2,717 STEMMING TYPES</w:t>
       </w:r>
     </w:p>
     <w:tbl>
@@ -9710,7 +9744,7 @@
                 <w:color w:val="000000"/>
                 <w:sz w:val="18"/>
               </w:rPr>
-              <w:t>48.04%</w:t>
+              <w:t>47.77%</w:t>
             </w:r>
           </w:p>
         </w:tc>
@@ -9817,7 +9851,7 @@
                 <w:color w:val="000000"/>
                 <w:sz w:val="18"/>
               </w:rPr>
-              <w:t>50.96%</w:t>
+              <w:t>50.68%</w:t>
             </w:r>
           </w:p>
         </w:tc>
@@ -9838,7 +9872,7 @@
                 <w:color w:val="000000"/>
                 <w:sz w:val="18"/>
               </w:rPr>
-              <w:t>12.3%</w:t>
+              <w:t>12.2%</w:t>
             </w:r>
           </w:p>
         </w:tc>
@@ -9880,7 +9914,7 @@
                 <w:color w:val="000000"/>
                 <w:sz w:val="18"/>
               </w:rPr>
-              <w:t>0.914</w:t>
+              <w:t>0.919</w:t>
             </w:r>
           </w:p>
         </w:tc>
@@ -9924,7 +9958,7 @@
                 <w:color w:val="000000"/>
                 <w:sz w:val="18"/>
               </w:rPr>
-              <w:t>79.64%</w:t>
+              <w:t>79.21%</w:t>
             </w:r>
           </w:p>
         </w:tc>
@@ -9945,7 +9979,7 @@
                 <w:color w:val="000000"/>
                 <w:sz w:val="18"/>
               </w:rPr>
-              <w:t>77.9%</w:t>
+              <w:t>77.0%</w:t>
             </w:r>
           </w:p>
         </w:tc>
@@ -9987,7 +10021,7 @@
                 <w:color w:val="000000"/>
                 <w:sz w:val="18"/>
               </w:rPr>
-              <w:t>0.279</w:t>
+              <w:t>0.314</w:t>
             </w:r>
           </w:p>
         </w:tc>
@@ -10022,7 +10056,7 @@
           <w:color w:val="000000"/>
           <w:sz w:val="20"/>
         </w:rPr>
-        <w:t>Table VII reports the development set. The figure is higher than the held-out result, and part of that difference is an artefact of construction, as Section V.B explains. It is reported for comparability with the baseline, which is scored identically, and because Paice's indices are more stable on the larger set. On the types requiring a strip the margin is wider still: 77.9% against 12.3%, a factor of six.</w:t>
+        <w:t>Table VII reports the development set. The figure is higher than the held-out result. The revisions described in Section V.B account for 0.07 points of that gap, so the explanation lies elsewhere: it is orthographic, and Section VII.D gives it. The development set is reported for comparability with the baseline, which is scored identically, and because Paice's indices are more stable on the larger set. On the types requiring a strip the margin is wider still: 77.0% against 12.2%, a factor of six.</w:t>
       </w:r>
     </w:p>
     <w:p>
@@ -10193,7 +10227,7 @@
                 <w:color w:val="000000"/>
                 <w:sz w:val="18"/>
               </w:rPr>
-              <w:t>79.64%</w:t>
+              <w:t>79.21%</w:t>
             </w:r>
           </w:p>
         </w:tc>
@@ -10214,7 +10248,7 @@
                 <w:color w:val="000000"/>
                 <w:sz w:val="18"/>
               </w:rPr>
-              <w:t>75.05%</w:t>
+              <w:t>71.14%</w:t>
             </w:r>
           </w:p>
         </w:tc>
@@ -10258,7 +10292,7 @@
                 <w:color w:val="000000"/>
                 <w:sz w:val="18"/>
               </w:rPr>
-              <w:t>71.84% (−7.81)</w:t>
+              <w:t>71.44% (−7.77)</w:t>
             </w:r>
           </w:p>
         </w:tc>
@@ -10279,7 +10313,7 @@
                 <w:color w:val="000000"/>
                 <w:sz w:val="18"/>
               </w:rPr>
-              <w:t>61.73% (−13.32)</w:t>
+              <w:t>58.52% (−12.63)</w:t>
             </w:r>
           </w:p>
         </w:tc>
@@ -10323,7 +10357,7 @@
                 <w:color w:val="000000"/>
                 <w:sz w:val="18"/>
               </w:rPr>
-              <w:t>76.68% (−2.96)</w:t>
+              <w:t>76.26% (−2.94)</w:t>
             </w:r>
           </w:p>
         </w:tc>
@@ -10344,7 +10378,7 @@
                 <w:color w:val="000000"/>
                 <w:sz w:val="18"/>
               </w:rPr>
-              <w:t>72.94% (−2.11)</w:t>
+              <w:t>69.14% (−2.00)</w:t>
             </w:r>
           </w:p>
         </w:tc>
@@ -10388,7 +10422,7 @@
                 <w:color w:val="000000"/>
                 <w:sz w:val="18"/>
               </w:rPr>
-              <w:t>78.76% (−0.89)</w:t>
+              <w:t>78.32% (−0.88)</w:t>
             </w:r>
           </w:p>
         </w:tc>
@@ -10409,7 +10443,7 @@
                 <w:color w:val="000000"/>
                 <w:sz w:val="18"/>
               </w:rPr>
-              <w:t>75.69% (+0.63)</w:t>
+              <w:t>71.74% (+0.60)</w:t>
             </w:r>
           </w:p>
         </w:tc>
@@ -10453,7 +10487,7 @@
                 <w:color w:val="000000"/>
                 <w:sz w:val="18"/>
               </w:rPr>
-              <w:t>79.35% (−0.30)</w:t>
+              <w:t>78.91% (−0.29)</w:t>
             </w:r>
           </w:p>
         </w:tc>
@@ -10474,7 +10508,7 @@
                 <w:color w:val="000000"/>
                 <w:sz w:val="18"/>
               </w:rPr>
-              <w:t>74.84% (−0.21)</w:t>
+              <w:t>70.94% (−0.20)</w:t>
             </w:r>
           </w:p>
         </w:tc>
@@ -10518,7 +10552,7 @@
                 <w:color w:val="000000"/>
                 <w:sz w:val="18"/>
               </w:rPr>
-              <w:t>79.61% (−0.04)</w:t>
+              <w:t>79.17% (−0.04)</w:t>
             </w:r>
           </w:p>
         </w:tc>
@@ -10539,7 +10573,7 @@
                 <w:color w:val="000000"/>
                 <w:sz w:val="18"/>
               </w:rPr>
-              <w:t>75.26% (+0.21)</w:t>
+              <w:t>71.34% (+0.20)</w:t>
             </w:r>
           </w:p>
         </w:tc>
@@ -10583,7 +10617,7 @@
                 <w:color w:val="000000"/>
                 <w:sz w:val="18"/>
               </w:rPr>
-              <w:t>78.57% (−1.07)</w:t>
+              <w:t>78.17% (−1.03)</w:t>
             </w:r>
           </w:p>
         </w:tc>
@@ -10604,7 +10638,7 @@
                 <w:color w:val="000000"/>
                 <w:sz w:val="18"/>
               </w:rPr>
-              <w:t>74.00% (−1.06)</w:t>
+              <w:t>70.14% (−1.00)</w:t>
             </w:r>
           </w:p>
         </w:tc>
@@ -10649,7 +10683,7 @@
           <w:color w:val="000000"/>
           <w:sz w:val="20"/>
         </w:rPr>
-        <w:t>The suffix inventory does most of the work, and removing it costs 13.3 points on held-out text. The author's length rules contribute between two and three points on both sets.</w:t>
+        <w:t>The suffix inventory does most of the work, and removing it costs 12.6 points on held-out text. The author's length rules contribute between two and three points on both sets.</w:t>
       </w:r>
     </w:p>
     <w:p>
@@ -11010,7 +11044,7 @@
           <w:color w:val="000000"/>
           <w:sz w:val="20"/>
         </w:rPr>
-        <w:t>The corpus lexicon is worth 0.89 points on the development set and −0.63 on held-out text. Its contribution is now marginal, because the uniform-strip and length rules decide most cases before the scorer is consulted. We report this plainly: the system should not be described as lexicon-driven.</w:t>
+        <w:t>The corpus lexicon is worth 0.88 points on the development set and −0.60 on held-out text. Its contribution is now marginal, because the uniform-strip and length rules decide most cases before the scorer is consulted. We report this plainly: the system should not be described as lexicon-driven.</w:t>
       </w:r>
     </w:p>
     <w:p>
@@ -11027,7 +11061,7 @@
           <w:color w:val="000000"/>
           <w:sz w:val="20"/>
         </w:rPr>
-        <w:t>Enabling the verb dictionary costs about one point on both sets, for the reason given in Section IV.F. Its proper contribution is to the lemma types, where it answers 52 of the 210 in the development set against 8 without it.</w:t>
+        <w:t>Enabling the verb dictionary costs about one point on both sets, for the reason given in Section IV.F. Its proper contribution is to the lemma types, where it answers 51 of the 195 in the development set against 8 without it.</w:t>
       </w:r>
     </w:p>
     <w:p>
@@ -11231,7 +11265,7 @@
           <w:color w:val="000000"/>
           <w:sz w:val="20"/>
         </w:rPr>
-        <w:t>Making rule matching insensitive to which ye is written, while leaving the output letters untouched, corrected this. On the development set, which is written entirely in one convention, exact matching scores 0.41 points higher; on held-out news text the folded comparison is worth 1.06 points, so it earns its place on the set that reflects real text. This is the clearest instance in the project of a defect that a single-source evaluation set could not have revealed.</w:t>
+        <w:t>Making rule matching insensitive to which ye is written, while leaving the output letters untouched, corrected this. On the development set, which is written entirely in one convention, exact matching scores 0.40 points higher; on held-out news text the folded comparison is worth 1.00 point, so it earns its place on the set that reflects real text. This is the clearest instance in the project of a defect that a single-source evaluation set could not have revealed.</w:t>
       </w:r>
     </w:p>
     <w:p>
@@ -11297,7 +11331,7 @@
           <w:color w:val="000000"/>
           <w:sz w:val="20"/>
         </w:rPr>
-        <w:t xml:space="preserve">Some rules are simply wrong. Three were identified and corrected during this work: a standalone rule for the verbal </w:t>
+        <w:t xml:space="preserve">Some rules are simply wrong. Three were identified and removed during this work: a standalone rule for the verbal </w:t>
       </w:r>
       <w:r>
         <w:rPr>
@@ -11328,7 +11362,7 @@
           <w:color w:val="000000"/>
           <w:sz w:val="20"/>
         </w:rPr>
-        <w:t xml:space="preserve"> was correct in 0 of 26 firings, because it only ever applied to nouns where </w:t>
+        <w:t xml:space="preserve">, which only ever applied to nouns where </w:t>
       </w:r>
       <w:r>
         <w:rPr>
@@ -11359,7 +11393,7 @@
           <w:color w:val="000000"/>
           <w:sz w:val="20"/>
         </w:rPr>
-        <w:t xml:space="preserve"> is root; a rule removing </w:t>
+        <w:t xml:space="preserve"> belongs to the root and so turned </w:t>
       </w:r>
       <w:r>
         <w:rPr>
@@ -11370,7 +11404,7 @@
           <w:sz w:val="22"/>
           <w:rtl w:val="1"/>
         </w:rPr>
-        <w:t>نی</w:t>
+        <w:t>کابل</w:t>
       </w:r>
       <w:r>
         <w:rPr>
@@ -11390,7 +11424,7 @@
           <w:color w:val="000000"/>
           <w:sz w:val="20"/>
         </w:rPr>
-        <w:t xml:space="preserve"> as a unit was correct in 3 of 29, since the affix is usually the </w:t>
+        <w:t xml:space="preserve"> into </w:t>
       </w:r>
       <w:r>
         <w:rPr>
@@ -11401,6 +11435,68 @@
           <w:sz w:val="22"/>
           <w:rtl w:val="1"/>
         </w:rPr>
+        <w:t>کاب</w:t>
+      </w:r>
+      <w:r>
+        <w:rPr>
+          <w:rFonts w:ascii="Times New Roman" w:hAnsi="Times New Roman" w:cs="Times New Roman" w:eastAsia="Times New Roman"/>
+          <w:b w:val="0"/>
+          <w:i w:val="0"/>
+          <w:color w:val="000000"/>
+          <w:sz w:val="2"/>
+        </w:rPr>
+        <w:t>‎</w:t>
+      </w:r>
+      <w:r>
+        <w:rPr>
+          <w:rFonts w:ascii="Times New Roman" w:hAnsi="Times New Roman" w:cs="Times New Roman" w:eastAsia="Times New Roman"/>
+          <w:b w:val="0"/>
+          <w:i w:val="0"/>
+          <w:color w:val="000000"/>
+          <w:sz w:val="20"/>
+        </w:rPr>
+        <w:t xml:space="preserve">; a rule removing </w:t>
+      </w:r>
+      <w:r>
+        <w:rPr>
+          <w:rFonts w:ascii="Noto Naskh Arabic" w:hAnsi="Noto Naskh Arabic" w:cs="Noto Naskh Arabic" w:eastAsia="Noto Naskh Arabic"/>
+          <w:b w:val="0"/>
+          <w:i w:val="0"/>
+          <w:color w:val="000000"/>
+          <w:sz w:val="22"/>
+          <w:rtl w:val="1"/>
+        </w:rPr>
+        <w:t>نی</w:t>
+      </w:r>
+      <w:r>
+        <w:rPr>
+          <w:rFonts w:ascii="Times New Roman" w:hAnsi="Times New Roman" w:cs="Times New Roman" w:eastAsia="Times New Roman"/>
+          <w:b w:val="0"/>
+          <w:i w:val="0"/>
+          <w:color w:val="000000"/>
+          <w:sz w:val="2"/>
+        </w:rPr>
+        <w:t>‎</w:t>
+      </w:r>
+      <w:r>
+        <w:rPr>
+          <w:rFonts w:ascii="Times New Roman" w:hAnsi="Times New Roman" w:cs="Times New Roman" w:eastAsia="Times New Roman"/>
+          <w:b w:val="0"/>
+          <w:i w:val="0"/>
+          <w:color w:val="000000"/>
+          <w:sz w:val="20"/>
+        </w:rPr>
+        <w:t xml:space="preserve"> as a unit, where the affix is usually the </w:t>
+      </w:r>
+      <w:r>
+        <w:rPr>
+          <w:rFonts w:ascii="Noto Naskh Arabic" w:hAnsi="Noto Naskh Arabic" w:cs="Noto Naskh Arabic" w:eastAsia="Noto Naskh Arabic"/>
+          <w:b w:val="0"/>
+          <w:i w:val="0"/>
+          <w:color w:val="000000"/>
+          <w:sz w:val="22"/>
+          <w:rtl w:val="1"/>
+        </w:rPr>
         <w:t>ی</w:t>
       </w:r>
       <w:r>
@@ -11421,7 +11517,100 @@
           <w:color w:val="000000"/>
           <w:sz w:val="20"/>
         </w:rPr>
-        <w:t xml:space="preserve"> alone; and a feminine restoration rule was correct in 29 of 84. These were defects, not ambiguity, and fixing them was worth roughly three points.</w:t>
+        <w:t xml:space="preserve"> alone; and a rule restoring a feminine </w:t>
+      </w:r>
+      <w:r>
+        <w:rPr>
+          <w:rFonts w:ascii="Noto Naskh Arabic" w:hAnsi="Noto Naskh Arabic" w:cs="Noto Naskh Arabic" w:eastAsia="Noto Naskh Arabic"/>
+          <w:b w:val="0"/>
+          <w:i w:val="0"/>
+          <w:color w:val="000000"/>
+          <w:sz w:val="22"/>
+          <w:rtl w:val="1"/>
+        </w:rPr>
+        <w:t>ه</w:t>
+      </w:r>
+      <w:r>
+        <w:rPr>
+          <w:rFonts w:ascii="Times New Roman" w:hAnsi="Times New Roman" w:cs="Times New Roman" w:eastAsia="Times New Roman"/>
+          <w:b w:val="0"/>
+          <w:i w:val="0"/>
+          <w:color w:val="000000"/>
+          <w:sz w:val="2"/>
+        </w:rPr>
+        <w:t>‎</w:t>
+      </w:r>
+      <w:r>
+        <w:rPr>
+          <w:rFonts w:ascii="Times New Roman" w:hAnsi="Times New Roman" w:cs="Times New Roman" w:eastAsia="Times New Roman"/>
+          <w:b w:val="0"/>
+          <w:i w:val="0"/>
+          <w:color w:val="000000"/>
+          <w:sz w:val="20"/>
+        </w:rPr>
+        <w:t xml:space="preserve"> to any stem that had lost one, which produced </w:t>
+      </w:r>
+      <w:r>
+        <w:rPr>
+          <w:rFonts w:ascii="Noto Naskh Arabic" w:hAnsi="Noto Naskh Arabic" w:cs="Noto Naskh Arabic" w:eastAsia="Noto Naskh Arabic"/>
+          <w:b w:val="0"/>
+          <w:i w:val="0"/>
+          <w:color w:val="000000"/>
+          <w:sz w:val="22"/>
+          <w:rtl w:val="1"/>
+        </w:rPr>
+        <w:t>کورونو</w:t>
+      </w:r>
+      <w:r>
+        <w:rPr>
+          <w:rFonts w:ascii="Times New Roman" w:hAnsi="Times New Roman" w:cs="Times New Roman" w:eastAsia="Times New Roman"/>
+          <w:b w:val="0"/>
+          <w:i w:val="0"/>
+          <w:color w:val="000000"/>
+          <w:sz w:val="2"/>
+        </w:rPr>
+        <w:t>‎</w:t>
+      </w:r>
+      <w:r>
+        <w:rPr>
+          <w:rFonts w:ascii="Times New Roman" w:hAnsi="Times New Roman" w:cs="Times New Roman" w:eastAsia="Times New Roman"/>
+          <w:b w:val="0"/>
+          <w:i w:val="0"/>
+          <w:color w:val="000000"/>
+          <w:sz w:val="20"/>
+        </w:rPr>
+        <w:t xml:space="preserve"> → </w:t>
+      </w:r>
+      <w:r>
+        <w:rPr>
+          <w:rFonts w:ascii="Noto Naskh Arabic" w:hAnsi="Noto Naskh Arabic" w:cs="Noto Naskh Arabic" w:eastAsia="Noto Naskh Arabic"/>
+          <w:b w:val="0"/>
+          <w:i w:val="0"/>
+          <w:color w:val="000000"/>
+          <w:sz w:val="22"/>
+          <w:rtl w:val="1"/>
+        </w:rPr>
+        <w:t>کورونه</w:t>
+      </w:r>
+      <w:r>
+        <w:rPr>
+          <w:rFonts w:ascii="Times New Roman" w:hAnsi="Times New Roman" w:cs="Times New Roman" w:eastAsia="Times New Roman"/>
+          <w:b w:val="0"/>
+          <w:i w:val="0"/>
+          <w:color w:val="000000"/>
+          <w:sz w:val="2"/>
+        </w:rPr>
+        <w:t>‎</w:t>
+      </w:r>
+      <w:r>
+        <w:rPr>
+          <w:rFonts w:ascii="Times New Roman" w:hAnsi="Times New Roman" w:cs="Times New Roman" w:eastAsia="Times New Roman"/>
+          <w:b w:val="0"/>
+          <w:i w:val="0"/>
+          <w:color w:val="000000"/>
+          <w:sz w:val="20"/>
+        </w:rPr>
+        <w:t>. These were defects rather than ambiguity. We give the words rather than firing counts because the counts were measured against an inventory that has since changed and cannot be recomputed from the released code.</w:t>
       </w:r>
     </w:p>
     <w:p>
@@ -11469,7 +11658,7 @@
           <w:color w:val="000000"/>
           <w:sz w:val="20"/>
         </w:rPr>
-        <w:t xml:space="preserve"> from a short word fires 226 times on the development set and is correct 161 times. </w:t>
+        <w:t xml:space="preserve"> from a short word fires 131 times on the development set and is correct 86 times. </w:t>
       </w:r>
       <w:r>
         <w:rPr>
@@ -11593,7 +11782,7 @@
           <w:color w:val="000000"/>
           <w:sz w:val="20"/>
         </w:rPr>
-        <w:t xml:space="preserve"> is wrong, and the two words are indistinguishable in shape. Removing the rule loses more than it saves: overall accuracy falls by 1.63 points. No reformulation conditioned on the surface form can help; only a lexical resource can.</w:t>
+        <w:t xml:space="preserve"> is wrong, and the two words are indistinguishable in shape. Removing the rule loses more than it saves: overall accuracy falls by 1.62 points. No reformulation conditioned on the surface form can help; only a lexical resource can.</w:t>
       </w:r>
     </w:p>
     <w:p>
@@ -11610,115 +11799,6 @@
           <w:sz w:val="20"/>
         </w:rPr>
         <w:t>B. What limits the current accuracy</w:t>
-      </w:r>
-    </w:p>
-    <w:p>
-      <w:pPr>
-        <w:spacing w:after="120" w:before="0" w:line="259" w:lineRule="auto"/>
-        <w:jc w:val="both"/>
-      </w:pPr>
-      <w:r>
-        <w:rPr>
-          <w:rFonts w:ascii="Times New Roman" w:hAnsi="Times New Roman" w:cs="Times New Roman" w:eastAsia="Times New Roman"/>
-          <w:b w:val="0"/>
-          <w:i w:val="0"/>
-          <w:color w:val="000000"/>
-          <w:sz w:val="20"/>
-        </w:rPr>
-        <w:t xml:space="preserve">Of the remaining errors on the development set, roughly 43% are over-strips and 29% are types whose reference is a different word. Within the second group, 116 of 158 are verb forms that a more complete verb dictionary would cover, and only 5 types in the whole set resist every available method. The practical ceiling for a rule-based system on this data is therefore high, and the shortfall is attributable to the </w:t>
-      </w:r>
-      <w:r>
-        <w:rPr>
-          <w:rFonts w:ascii="Noto Naskh Arabic" w:hAnsi="Noto Naskh Arabic" w:cs="Noto Naskh Arabic" w:eastAsia="Noto Naskh Arabic"/>
-          <w:b w:val="0"/>
-          <w:i w:val="0"/>
-          <w:color w:val="000000"/>
-          <w:sz w:val="22"/>
-          <w:rtl w:val="1"/>
-        </w:rPr>
-        <w:t>ه</w:t>
-      </w:r>
-      <w:r>
-        <w:rPr>
-          <w:rFonts w:ascii="Times New Roman" w:hAnsi="Times New Roman" w:cs="Times New Roman" w:eastAsia="Times New Roman"/>
-          <w:b w:val="0"/>
-          <w:i w:val="0"/>
-          <w:color w:val="000000"/>
-          <w:sz w:val="2"/>
-        </w:rPr>
-        <w:t>‎</w:t>
-      </w:r>
-      <w:r>
-        <w:rPr>
-          <w:rFonts w:ascii="Times New Roman" w:hAnsi="Times New Roman" w:cs="Times New Roman" w:eastAsia="Times New Roman"/>
-          <w:b w:val="0"/>
-          <w:i w:val="0"/>
-          <w:color w:val="000000"/>
-          <w:sz w:val="20"/>
-        </w:rPr>
-        <w:t>/</w:t>
-      </w:r>
-      <w:r>
-        <w:rPr>
-          <w:rFonts w:ascii="Noto Naskh Arabic" w:hAnsi="Noto Naskh Arabic" w:cs="Noto Naskh Arabic" w:eastAsia="Noto Naskh Arabic"/>
-          <w:b w:val="0"/>
-          <w:i w:val="0"/>
-          <w:color w:val="000000"/>
-          <w:sz w:val="22"/>
-          <w:rtl w:val="1"/>
-        </w:rPr>
-        <w:t>ی</w:t>
-      </w:r>
-      <w:r>
-        <w:rPr>
-          <w:rFonts w:ascii="Times New Roman" w:hAnsi="Times New Roman" w:cs="Times New Roman" w:eastAsia="Times New Roman"/>
-          <w:b w:val="0"/>
-          <w:i w:val="0"/>
-          <w:color w:val="000000"/>
-          <w:sz w:val="2"/>
-        </w:rPr>
-        <w:t>‎</w:t>
-      </w:r>
-      <w:r>
-        <w:rPr>
-          <w:rFonts w:ascii="Times New Roman" w:hAnsi="Times New Roman" w:cs="Times New Roman" w:eastAsia="Times New Roman"/>
-          <w:b w:val="0"/>
-          <w:i w:val="0"/>
-          <w:color w:val="000000"/>
-          <w:sz w:val="20"/>
-        </w:rPr>
-        <w:t>/</w:t>
-      </w:r>
-      <w:r>
-        <w:rPr>
-          <w:rFonts w:ascii="Noto Naskh Arabic" w:hAnsi="Noto Naskh Arabic" w:cs="Noto Naskh Arabic" w:eastAsia="Noto Naskh Arabic"/>
-          <w:b w:val="0"/>
-          <w:i w:val="0"/>
-          <w:color w:val="000000"/>
-          <w:sz w:val="22"/>
-          <w:rtl w:val="1"/>
-        </w:rPr>
-        <w:t>ې</w:t>
-      </w:r>
-      <w:r>
-        <w:rPr>
-          <w:rFonts w:ascii="Times New Roman" w:hAnsi="Times New Roman" w:cs="Times New Roman" w:eastAsia="Times New Roman"/>
-          <w:b w:val="0"/>
-          <w:i w:val="0"/>
-          <w:color w:val="000000"/>
-          <w:sz w:val="2"/>
-        </w:rPr>
-        <w:t>‎</w:t>
-      </w:r>
-      <w:r>
-        <w:rPr>
-          <w:rFonts w:ascii="Times New Roman" w:hAnsi="Times New Roman" w:cs="Times New Roman" w:eastAsia="Times New Roman"/>
-          <w:b w:val="0"/>
-          <w:i w:val="0"/>
-          <w:color w:val="000000"/>
-          <w:sz w:val="20"/>
-        </w:rPr>
-        <w:t xml:space="preserve"> ambiguity and to loanwords rather than to missing affixes.</w:t>
       </w:r>
     </w:p>
     <w:p>
@@ -11735,7 +11815,117 @@
           <w:color w:val="000000"/>
           <w:sz w:val="20"/>
         </w:rPr>
-        <w:t>We tested the obvious remedy and report the result because it is negative. A 257-entry list of development-set words that should be left unchanged raises development accuracy by 8.8 points and held-out accuracy by zero: of the 52 held-out types needing the same treatment, none appear in the list. The list is pure memorisation of one sample. The generalizing form of the same idea is a named-entity and loanword lexicon, since the words concerned are overwhelmingly names and borrowings, and we leave that to future work.</w:t>
+        <w:t xml:space="preserve">The 565 development-set errors divide into three kinds. 323 of them, 57%, are over-strips, where the system removed more than the reference does; 201, 36%, are under-strips, and 101 of those are words the system left untouched altogether; the remaining 41 are the same length as the reference but differ in which letters survive. The held-out set behaves the same way, 53% and 42%. Over-stripping is therefore the larger problem on both sets, which is what one would expect of a system whose scorer rewards removing affix material, and it is concentrated on the </w:t>
+      </w:r>
+      <w:r>
+        <w:rPr>
+          <w:rFonts w:ascii="Noto Naskh Arabic" w:hAnsi="Noto Naskh Arabic" w:cs="Noto Naskh Arabic" w:eastAsia="Noto Naskh Arabic"/>
+          <w:b w:val="0"/>
+          <w:i w:val="0"/>
+          <w:color w:val="000000"/>
+          <w:sz w:val="22"/>
+          <w:rtl w:val="1"/>
+        </w:rPr>
+        <w:t>ه</w:t>
+      </w:r>
+      <w:r>
+        <w:rPr>
+          <w:rFonts w:ascii="Times New Roman" w:hAnsi="Times New Roman" w:cs="Times New Roman" w:eastAsia="Times New Roman"/>
+          <w:b w:val="0"/>
+          <w:i w:val="0"/>
+          <w:color w:val="000000"/>
+          <w:sz w:val="2"/>
+        </w:rPr>
+        <w:t>‎</w:t>
+      </w:r>
+      <w:r>
+        <w:rPr>
+          <w:rFonts w:ascii="Times New Roman" w:hAnsi="Times New Roman" w:cs="Times New Roman" w:eastAsia="Times New Roman"/>
+          <w:b w:val="0"/>
+          <w:i w:val="0"/>
+          <w:color w:val="000000"/>
+          <w:sz w:val="20"/>
+        </w:rPr>
+        <w:t>/</w:t>
+      </w:r>
+      <w:r>
+        <w:rPr>
+          <w:rFonts w:ascii="Noto Naskh Arabic" w:hAnsi="Noto Naskh Arabic" w:cs="Noto Naskh Arabic" w:eastAsia="Noto Naskh Arabic"/>
+          <w:b w:val="0"/>
+          <w:i w:val="0"/>
+          <w:color w:val="000000"/>
+          <w:sz w:val="22"/>
+          <w:rtl w:val="1"/>
+        </w:rPr>
+        <w:t>ی</w:t>
+      </w:r>
+      <w:r>
+        <w:rPr>
+          <w:rFonts w:ascii="Times New Roman" w:hAnsi="Times New Roman" w:cs="Times New Roman" w:eastAsia="Times New Roman"/>
+          <w:b w:val="0"/>
+          <w:i w:val="0"/>
+          <w:color w:val="000000"/>
+          <w:sz w:val="2"/>
+        </w:rPr>
+        <w:t>‎</w:t>
+      </w:r>
+      <w:r>
+        <w:rPr>
+          <w:rFonts w:ascii="Times New Roman" w:hAnsi="Times New Roman" w:cs="Times New Roman" w:eastAsia="Times New Roman"/>
+          <w:b w:val="0"/>
+          <w:i w:val="0"/>
+          <w:color w:val="000000"/>
+          <w:sz w:val="20"/>
+        </w:rPr>
+        <w:t>/</w:t>
+      </w:r>
+      <w:r>
+        <w:rPr>
+          <w:rFonts w:ascii="Noto Naskh Arabic" w:hAnsi="Noto Naskh Arabic" w:cs="Noto Naskh Arabic" w:eastAsia="Noto Naskh Arabic"/>
+          <w:b w:val="0"/>
+          <w:i w:val="0"/>
+          <w:color w:val="000000"/>
+          <w:sz w:val="22"/>
+          <w:rtl w:val="1"/>
+        </w:rPr>
+        <w:t>ې</w:t>
+      </w:r>
+      <w:r>
+        <w:rPr>
+          <w:rFonts w:ascii="Times New Roman" w:hAnsi="Times New Roman" w:cs="Times New Roman" w:eastAsia="Times New Roman"/>
+          <w:b w:val="0"/>
+          <w:i w:val="0"/>
+          <w:color w:val="000000"/>
+          <w:sz w:val="2"/>
+        </w:rPr>
+        <w:t>‎</w:t>
+      </w:r>
+      <w:r>
+        <w:rPr>
+          <w:rFonts w:ascii="Times New Roman" w:hAnsi="Times New Roman" w:cs="Times New Roman" w:eastAsia="Times New Roman"/>
+          <w:b w:val="0"/>
+          <w:i w:val="0"/>
+          <w:color w:val="000000"/>
+          <w:sz w:val="20"/>
+        </w:rPr>
+        <w:t xml:space="preserve"> ambiguity and on loanwords rather than on missing affixes.</w:t>
+      </w:r>
+    </w:p>
+    <w:p>
+      <w:pPr>
+        <w:spacing w:after="120" w:before="0" w:line="259" w:lineRule="auto"/>
+        <w:ind w:firstLine="259"/>
+        <w:jc w:val="both"/>
+      </w:pPr>
+      <w:r>
+        <w:rPr>
+          <w:rFonts w:ascii="Times New Roman" w:hAnsi="Times New Roman" w:cs="Times New Roman" w:eastAsia="Times New Roman"/>
+          <w:b w:val="0"/>
+          <w:i w:val="0"/>
+          <w:color w:val="000000"/>
+          <w:sz w:val="20"/>
+        </w:rPr>
+        <w:t>We tested the obvious remedy and report the result because it is negative. A 257-entry list of development-set words that should be left unchanged raises development accuracy by 8.7 points and held-out accuracy by zero: of the 52 held-out types needing the same treatment, none appear in the list. The list is pure memorisation of one sample. The generalizing form of the same idea is a named-entity and loanword lexicon, since the words concerned are overwhelmingly names and borrowings, and we leave that to future work.</w:t>
       </w:r>
     </w:p>
     <w:p>
@@ -11785,7 +11975,7 @@
           <w:color w:val="000000"/>
           <w:sz w:val="20"/>
         </w:rPr>
-        <w:t>The annotation was produced by a single annotator and reviewed by two further native speakers, who corrected the cases they disagreed with rather than annotating the set independently. Inter-annotator agreement therefore cannot be computed, and systematic bias cannot be excluded.</w:t>
+        <w:t>The development set was annotated independently by three native speakers and adjudicated by the author, but the individual passes were not retained, so inter-annotator agreement cannot be computed from the released data. The held-out set had one annotator. Systematic bias therefore cannot be excluded on either set. This is the weakest part of the evidence. The two reference columns released with the held-out set, gold_stem and expert_stem, are identical in all 500 rows: they are one annotation stored twice and not two passes, and we name them here because the file does not. A double annotation of a fresh sample, with agreement reported before disagreements are resolved, is the obvious next step and is not claimed as done.</w:t>
       </w:r>
     </w:p>
     <w:p>
@@ -11802,7 +11992,7 @@
           <w:color w:val="000000"/>
           <w:sz w:val="20"/>
         </w:rPr>
-        <w:t>Of 118 affix rules, 39 cite a published description directly and 49 carry no reference at all. Of 42 verbs in the dictionary, 34 are checked against a printed grammar and 8 are marked unverified in the released documentation. We prefer to label these rather than to present them as settled.</w:t>
+        <w:t>Of 117 affix rules, 39 cite a published description directly and 49 carry no reference at all. Of 42 verbs in the dictionary, 34 are checked against a printed grammar and 8 are marked unverified in the released documentation. We prefer to label these rather than to present them as settled.</w:t>
       </w:r>
     </w:p>
     <w:p>
@@ -11819,7 +12009,7 @@
           <w:color w:val="000000"/>
           <w:sz w:val="20"/>
         </w:rPr>
-        <w:t>Compounds are kept whole, which is a policy choice rather than a solution. An audit of the development set found 47 types where the annotation itself split a compound, contrary to the stated policy.</w:t>
+        <w:t>Compounds are kept whole, which is a policy choice rather than a solution, and the annotation does not follow it perfectly: an audit during development found types where the reference itself splits a compound. The released audit script reports every removal that matches no documented affix, which is where such cases surface.</w:t>
       </w:r>
     </w:p>
     <w:p>
@@ -11869,7 +12059,7 @@
           <w:color w:val="000000"/>
           <w:sz w:val="20"/>
         </w:rPr>
-        <w:t>We presented a rule-based stemmer for Pashto built from an affix inventory of 118 rules taken from published grammars, each recording its source, its productivity and an explicit decision about whether it may be applied. No machine learning is used, and every decision the system makes can be traced to a rule or a dictionary entry.</w:t>
+        <w:t>We presented a rule-based stemmer for Pashto built from an affix inventory of 117 rules taken from published grammars, each recording its source, its productivity and an explicit decision about whether it may be applied. No machine learning is used, and every decision the system makes can be traced to a rule or a dictionary entry.</w:t>
       </w:r>
     </w:p>
     <w:p>
@@ -11886,7 +12076,7 @@
           <w:color w:val="000000"/>
           <w:sz w:val="20"/>
         </w:rPr>
-        <w:t>On 473 held-out word types from news text, annotated blind and never used during development, the system reaches 75.05% exact-match accuracy against 42.49% for the published baseline, and 77.0% against 18.1% on the types that require a strip. On a 2,702-type development set it reaches 79.64% against 50.96%, with Paice's under-stemming index falling from 0.914 to 0.279.</w:t>
+        <w:t>On 499 held-out word types from news text, annotated blind and never used during development, the system reaches 71.14% exact-match accuracy against 40.48% for the published baseline, and 70.6% against 16.9% on the types that require a strip. On a 2,717-type development set it reaches 79.21% against 50.68%, with Paice's under-stemming index falling from 0.919 to 0.314.</w:t>
       </w:r>
     </w:p>
     <w:p>
@@ -12352,7 +12542,7 @@
           <w:color w:val="000000"/>
           <w:sz w:val="20"/>
         </w:rPr>
-        <w:t>The 118 rules in full, in the order the engine holds them. “Type” gives the side and whether the rule is inflectional or derivational; “min” is the shortest stem the rule is allowed to leave; “strip” is whether the engine may remove the affix at all. The entries marked no are documented and never applied, for the reasons given in Section IV.B. This table is generated directly from the rule objects by paper/make_inventory_tables.py, so it cannot drift from the implementation.</w:t>
+        <w:t>The 117 rules in full, in the order the engine holds them. “Type” gives the side and whether the rule is inflectional or derivational; “min” is the shortest stem the rule is allowed to leave; “strip” is whether the engine may remove the affix at all. The entries marked no are documented and never applied, for the reasons given in Section IV.B. This table is generated directly from the rule objects by paper/make_inventory_tables.py, so it cannot drift from the implementation.</w:t>
       </w:r>
     </w:p>
     <w:p>
@@ -13013,156 +13203,6 @@
                 <w:rtl w:val="1"/>
               </w:rPr>
               <w:t>ګانو</w:t>
-            </w:r>
-          </w:p>
-        </w:tc>
-        <w:tc>
-          <w:tcPr>
-            <w:tcW w:type="dxa" w:w="1368"/>
-          </w:tcPr>
-          <w:p>
-            <w:pPr>
-              <w:spacing w:after="0" w:before="0" w:line="240" w:lineRule="auto"/>
-            </w:pPr>
-            <w:r/>
-            <w:r>
-              <w:rPr>
-                <w:rFonts w:ascii="Times New Roman" w:hAnsi="Times New Roman" w:cs="Times New Roman" w:eastAsia="Times New Roman"/>
-                <w:b w:val="0"/>
-                <w:i w:val="0"/>
-                <w:color w:val="000000"/>
-                <w:sz w:val="16"/>
-              </w:rPr>
-              <w:t>suf, infl</w:t>
-            </w:r>
-          </w:p>
-        </w:tc>
-        <w:tc>
-          <w:tcPr>
-            <w:tcW w:type="dxa" w:w="648"/>
-          </w:tcPr>
-          <w:p>
-            <w:pPr>
-              <w:spacing w:after="0" w:before="0" w:line="240" w:lineRule="auto"/>
-            </w:pPr>
-            <w:r/>
-            <w:r>
-              <w:rPr>
-                <w:rFonts w:ascii="Times New Roman" w:hAnsi="Times New Roman" w:cs="Times New Roman" w:eastAsia="Times New Roman"/>
-                <w:b w:val="0"/>
-                <w:i w:val="0"/>
-                <w:color w:val="000000"/>
-                <w:sz w:val="16"/>
-              </w:rPr>
-              <w:t>2</w:t>
-            </w:r>
-          </w:p>
-        </w:tc>
-        <w:tc>
-          <w:tcPr>
-            <w:tcW w:type="dxa" w:w="1368"/>
-          </w:tcPr>
-          <w:p>
-            <w:pPr>
-              <w:spacing w:after="0" w:before="0" w:line="240" w:lineRule="auto"/>
-            </w:pPr>
-            <w:r/>
-            <w:r>
-              <w:rPr>
-                <w:rFonts w:ascii="Times New Roman" w:hAnsi="Times New Roman" w:cs="Times New Roman" w:eastAsia="Times New Roman"/>
-                <w:b w:val="0"/>
-                <w:i w:val="0"/>
-                <w:color w:val="000000"/>
-                <w:sz w:val="16"/>
-              </w:rPr>
-              <w:t>N</w:t>
-            </w:r>
-          </w:p>
-        </w:tc>
-        <w:tc>
-          <w:tcPr>
-            <w:tcW w:type="dxa" w:w="1584"/>
-          </w:tcPr>
-          <w:p>
-            <w:pPr>
-              <w:spacing w:after="0" w:before="0" w:line="240" w:lineRule="auto"/>
-            </w:pPr>
-            <w:r/>
-            <w:r>
-              <w:rPr>
-                <w:rFonts w:ascii="Times New Roman" w:hAnsi="Times New Roman" w:cs="Times New Roman" w:eastAsia="Times New Roman"/>
-                <w:b w:val="0"/>
-                <w:i w:val="0"/>
-                <w:color w:val="000000"/>
-                <w:sz w:val="16"/>
-              </w:rPr>
-              <w:t>productive</w:t>
-            </w:r>
-          </w:p>
-        </w:tc>
-        <w:tc>
-          <w:tcPr>
-            <w:tcW w:type="dxa" w:w="1440"/>
-          </w:tcPr>
-          <w:p>
-            <w:pPr>
-              <w:spacing w:after="0" w:before="0" w:line="240" w:lineRule="auto"/>
-            </w:pPr>
-            <w:r/>
-            <w:r>
-              <w:rPr>
-                <w:rFonts w:ascii="Times New Roman" w:hAnsi="Times New Roman" w:cs="Times New Roman" w:eastAsia="Times New Roman"/>
-                <w:b w:val="0"/>
-                <w:i w:val="0"/>
-                <w:color w:val="000000"/>
-                <w:sz w:val="16"/>
-              </w:rPr>
-              <w:t>high</w:t>
-            </w:r>
-          </w:p>
-        </w:tc>
-        <w:tc>
-          <w:tcPr>
-            <w:tcW w:type="dxa" w:w="1008"/>
-          </w:tcPr>
-          <w:p>
-            <w:pPr>
-              <w:spacing w:after="0" w:before="0" w:line="240" w:lineRule="auto"/>
-            </w:pPr>
-            <w:r/>
-            <w:r>
-              <w:rPr>
-                <w:rFonts w:ascii="Times New Roman" w:hAnsi="Times New Roman" w:cs="Times New Roman" w:eastAsia="Times New Roman"/>
-                <w:b w:val="0"/>
-                <w:i w:val="0"/>
-                <w:color w:val="000000"/>
-                <w:sz w:val="16"/>
-              </w:rPr>
-              <w:t>yes</w:t>
-            </w:r>
-          </w:p>
-        </w:tc>
-      </w:tr>
-      <w:tr>
-        <w:tc>
-          <w:tcPr>
-            <w:tcW w:type="dxa" w:w="1296"/>
-          </w:tcPr>
-          <w:p>
-            <w:pPr>
-              <w:spacing w:after="0" w:before="0" w:line="240" w:lineRule="auto"/>
-            </w:pPr>
-            <w:r/>
-            <w:r>
-              <w:rPr>
-                <w:rFonts w:ascii="Noto Naskh Arabic" w:hAnsi="Noto Naskh Arabic" w:cs="Noto Naskh Arabic" w:eastAsia="Noto Naskh Arabic"/>
-                <w:b w:val="0"/>
-                <w:i w:val="0"/>
-                <w:color w:val="000000"/>
-                <w:sz w:val="16"/>
-                <w:rtl w:val="1"/>
-              </w:rPr>
-              <w:t>ګانې</w:t>
             </w:r>
           </w:p>
         </w:tc>

</xml_diff>

<commit_message>
Disable the compound splitter; correct documentation that contradicted the paper
- compound splitter off by default: it conflicted with the keep-compounds-whole
  policy and was wrong on all 7 types it touched (held-out 71.14% -> 71.34%)
- release the two independent annotation passes; measured inter-annotator
  agreement 96.88%, Cohen's kappa 0.969 (experiments/agreement.py)
- annotation guidelines and policy corrected: no yeh letter is rewritten, no
  base-form restoration, superseded pre-filled-template protocol marked as such
- pipeline figure 93 -> 92 strippable rules; drop the old project description
  from the source; cite Cohen 1960 and Landis & Koch 1977
</commit_message>
<xml_diff>
--- a/paper/Pashto_Stemmer_Paper.docx
+++ b/paper/Pashto_Stemmer_Paper.docx
@@ -117,7 +117,23 @@
           <w:color w:val="000000"/>
           <w:sz w:val="20"/>
         </w:rPr>
-        <w:t>We also contribute two annotated evaluation sets, since none existed for Pashto stemming: a development set of 2,912 word types reviewed by two native-speaker Pashto educators, and a held-out set of 500 word types sampled from a news corpus, annotated with the reference field initially empty and never used during development. On the held-out set the proposed system reaches 71.14% exact-match accuracy against 40.48% for a faithful reimplementation of the prior system, and 70.6% against 16.9% on the subset of types that carry an affix. Paice's under-stemming index falls from 0.889 to 0.556. Of the 500 held-out types, 499 are within the stemming task and form the denominator for those figures; the one remaining type requires a different word and is reported separately.</w:t>
+        <w:t>Since no annotated set for Pashto stemming existed, we built two. A development set of 2,912 word types and a held-out set of 500 types sampled from news text were each annotated independently by three native-speaker Pashto educators, who agreed on 96.88% of stems (κ = 0.969). The held-out set was annotated with its reference column empty and was not consulted while the system was being developed. 499 of its 500 types fall within the stemming task and are the denominator below; the remaining one needs a different word and is reported apart.</w:t>
+      </w:r>
+    </w:p>
+    <w:p>
+      <w:pPr>
+        <w:spacing w:after="120" w:before="0" w:line="259" w:lineRule="auto"/>
+        <w:jc w:val="both"/>
+      </w:pPr>
+      <w:r>
+        <w:rPr>
+          <w:rFonts w:ascii="Times New Roman" w:hAnsi="Times New Roman" w:cs="Times New Roman" w:eastAsia="Times New Roman"/>
+          <w:b w:val="0"/>
+          <w:i w:val="0"/>
+          <w:color w:val="000000"/>
+          <w:sz w:val="20"/>
+        </w:rPr>
+        <w:t>On that set the proposed system reaches 71.34% exact-match accuracy against 40.48% for a faithful reimplementation of the prior system, and 70.6% against 16.9% on the types that carry an affix. Paice's under-stemming index falls from 0.889 to 0.556.</w:t>
       </w:r>
     </w:p>
     <w:p>
@@ -7703,6 +7719,147 @@
     </w:p>
     <w:p>
       <w:pPr>
+        <w:spacing w:after="120" w:before="0" w:line="259" w:lineRule="auto"/>
+        <w:ind w:firstLine="259"/>
+        <w:jc w:val="both"/>
+      </w:pPr>
+      <w:r>
+        <w:rPr>
+          <w:rFonts w:ascii="Times New Roman" w:hAnsi="Times New Roman" w:cs="Times New Roman" w:eastAsia="Times New Roman"/>
+          <w:b w:val="0"/>
+          <w:i w:val="0"/>
+          <w:color w:val="000000"/>
+          <w:sz w:val="20"/>
+        </w:rPr>
+        <w:t xml:space="preserve">A third component was implemented and then removed. A compound splitter returned the head of a word it judged to be a compound, which conflicted with the annotation policy's decision to keep compounds whole. Measured, it fired on seven types across the two evaluation sets and was wrong on all seven, usually because the “head” it returned was itself a suffix: </w:t>
+      </w:r>
+      <w:r>
+        <w:rPr>
+          <w:rFonts w:ascii="Noto Naskh Arabic" w:hAnsi="Noto Naskh Arabic" w:cs="Noto Naskh Arabic" w:eastAsia="Noto Naskh Arabic"/>
+          <w:b w:val="0"/>
+          <w:i w:val="0"/>
+          <w:color w:val="000000"/>
+          <w:sz w:val="22"/>
+          <w:rtl w:val="1"/>
+        </w:rPr>
+        <w:t>نړۍوال</w:t>
+      </w:r>
+      <w:r>
+        <w:rPr>
+          <w:rFonts w:ascii="Times New Roman" w:hAnsi="Times New Roman" w:cs="Times New Roman" w:eastAsia="Times New Roman"/>
+          <w:b w:val="0"/>
+          <w:i w:val="0"/>
+          <w:color w:val="000000"/>
+          <w:sz w:val="2"/>
+        </w:rPr>
+        <w:t>‎</w:t>
+      </w:r>
+      <w:r>
+        <w:rPr>
+          <w:rFonts w:ascii="Times New Roman" w:hAnsi="Times New Roman" w:cs="Times New Roman" w:eastAsia="Times New Roman"/>
+          <w:b w:val="0"/>
+          <w:i w:val="0"/>
+          <w:color w:val="000000"/>
+          <w:sz w:val="20"/>
+        </w:rPr>
+        <w:t xml:space="preserve"> → </w:t>
+      </w:r>
+      <w:r>
+        <w:rPr>
+          <w:rFonts w:ascii="Noto Naskh Arabic" w:hAnsi="Noto Naskh Arabic" w:cs="Noto Naskh Arabic" w:eastAsia="Noto Naskh Arabic"/>
+          <w:b w:val="0"/>
+          <w:i w:val="0"/>
+          <w:color w:val="000000"/>
+          <w:sz w:val="22"/>
+          <w:rtl w:val="1"/>
+        </w:rPr>
+        <w:t>وال</w:t>
+      </w:r>
+      <w:r>
+        <w:rPr>
+          <w:rFonts w:ascii="Times New Roman" w:hAnsi="Times New Roman" w:cs="Times New Roman" w:eastAsia="Times New Roman"/>
+          <w:b w:val="0"/>
+          <w:i w:val="0"/>
+          <w:color w:val="000000"/>
+          <w:sz w:val="2"/>
+        </w:rPr>
+        <w:t>‎</w:t>
+      </w:r>
+      <w:r>
+        <w:rPr>
+          <w:rFonts w:ascii="Times New Roman" w:hAnsi="Times New Roman" w:cs="Times New Roman" w:eastAsia="Times New Roman"/>
+          <w:b w:val="0"/>
+          <w:i w:val="0"/>
+          <w:color w:val="000000"/>
+          <w:sz w:val="20"/>
+        </w:rPr>
+        <w:t xml:space="preserve"> and </w:t>
+      </w:r>
+      <w:r>
+        <w:rPr>
+          <w:rFonts w:ascii="Noto Naskh Arabic" w:hAnsi="Noto Naskh Arabic" w:cs="Noto Naskh Arabic" w:eastAsia="Noto Naskh Arabic"/>
+          <w:b w:val="0"/>
+          <w:i w:val="0"/>
+          <w:color w:val="000000"/>
+          <w:sz w:val="22"/>
+          <w:rtl w:val="1"/>
+        </w:rPr>
+        <w:t>پټرولیم</w:t>
+      </w:r>
+      <w:r>
+        <w:rPr>
+          <w:rFonts w:ascii="Times New Roman" w:hAnsi="Times New Roman" w:cs="Times New Roman" w:eastAsia="Times New Roman"/>
+          <w:b w:val="0"/>
+          <w:i w:val="0"/>
+          <w:color w:val="000000"/>
+          <w:sz w:val="2"/>
+        </w:rPr>
+        <w:t>‎</w:t>
+      </w:r>
+      <w:r>
+        <w:rPr>
+          <w:rFonts w:ascii="Times New Roman" w:hAnsi="Times New Roman" w:cs="Times New Roman" w:eastAsia="Times New Roman"/>
+          <w:b w:val="0"/>
+          <w:i w:val="0"/>
+          <w:color w:val="000000"/>
+          <w:sz w:val="20"/>
+        </w:rPr>
+        <w:t xml:space="preserve"> → </w:t>
+      </w:r>
+      <w:r>
+        <w:rPr>
+          <w:rFonts w:ascii="Noto Naskh Arabic" w:hAnsi="Noto Naskh Arabic" w:cs="Noto Naskh Arabic" w:eastAsia="Noto Naskh Arabic"/>
+          <w:b w:val="0"/>
+          <w:i w:val="0"/>
+          <w:color w:val="000000"/>
+          <w:sz w:val="22"/>
+          <w:rtl w:val="1"/>
+        </w:rPr>
+        <w:t>یم</w:t>
+      </w:r>
+      <w:r>
+        <w:rPr>
+          <w:rFonts w:ascii="Times New Roman" w:hAnsi="Times New Roman" w:cs="Times New Roman" w:eastAsia="Times New Roman"/>
+          <w:b w:val="0"/>
+          <w:i w:val="0"/>
+          <w:color w:val="000000"/>
+          <w:sz w:val="2"/>
+        </w:rPr>
+        <w:t>‎</w:t>
+      </w:r>
+      <w:r>
+        <w:rPr>
+          <w:rFonts w:ascii="Times New Roman" w:hAnsi="Times New Roman" w:cs="Times New Roman" w:eastAsia="Times New Roman"/>
+          <w:b w:val="0"/>
+          <w:i w:val="0"/>
+          <w:color w:val="000000"/>
+          <w:sz w:val="20"/>
+        </w:rPr>
+        <w:t>. Disabling it is worth 0.22 points on the development set and 0.20 on held-out text. Splitting Pashto compounds reliably needs a lexicon of free forms that we do not have, and guessing at the boundary was worse than leaving it alone.</w:t>
+      </w:r>
+    </w:p>
+    <w:p>
+      <w:pPr>
         <w:keepNext/>
         <w:spacing w:before="160" w:after="80"/>
       </w:pPr>
@@ -7923,7 +8080,7 @@
           <w:color w:val="000000"/>
           <w:sz w:val="20"/>
         </w:rPr>
-        <w:t>2,912 word types were annotated independently by three native speakers of Pashto before the rule inventory was settled: the author, the principal of a Pashto-medium school, and a university teacher of the language. The three annotators did not see one another's work. The author then adjudicated the disagreements and produced the released reference. The individual passes were not kept as separate files, so inter-annotator agreement cannot be computed after the fact; we state the procedure rather than a coefficient, and treat the absence of that coefficient as a limitation rather than presenting adjudication as if it were agreement. The reference was then revised in 166 places, 5.7% of the set: 42 under documented policy decisions, each logged with its reason, and 116 verb forms brought into line with the verb analysis. The first annotation and both revised versions are released, so the revision can be inspected directly.</w:t>
+        <w:t>2,912 word types were annotated independently by three native speakers of Pashto before the rule inventory was settled: the author, the principal of a Pashto-medium school, and a university teacher of the language. None of the three saw another's work, and none saw any system output. The author then adjudicated the disagreements and produced the released reference.</w:t>
       </w:r>
     </w:p>
     <w:p>
@@ -7940,7 +8097,7 @@
           <w:color w:val="000000"/>
           <w:sz w:val="20"/>
         </w:rPr>
-        <w:t>Part of that revision is circular and we measure it rather than argue about it. Of the 116 verb rows, 81 were changed to the analysis the system itself produces, which is 3.0% of the stemming types. If such rows were inflating the result, accuracy on them would be far above the rest. It does not. Scored only on the 2,555 stemming types that were never revised at any stage, the system reaches 79.41%, slightly above the 79.21% it reaches over all 2,717. The revised rows score below average, not above, so removing them raises the figure by 0.20 points rather than lowering it.</w:t>
+        <w:t>Two of the three passes are released as separate files, and the agreement between them can therefore be recomputed rather than asserted. On the 2,725 types both annotated, they chose the same stem for 96.88%, which is a Cohen's κ [14] of 0.969. Reduced to the decision that matters most — whether the word carries an affix at all — they agree on 98.24%, κ = 0.965. The two coefficients answer different questions. Chance agreement on the full stem string is 0.001, because the label space is every substring of the word, so there κ adds little to the raw figure; on the binary decision chance agreement is 0.503, and the κ is doing real work. Both fall in the band Landis and Koch [15] describe as almost perfect agreement.</w:t>
       </w:r>
     </w:p>
     <w:p>
@@ -7957,7 +8114,24 @@
           <w:color w:val="000000"/>
           <w:sz w:val="20"/>
         </w:rPr>
-        <w:t>A weaker form of the concern survives measurement and should be stated anyway. Author and annotator are the same person, so the reference and the system may share an assumption that no amount of internal consistency would expose. That is why a second set was built, and why the held-out figure rather than this one is treated as the result.</w:t>
+        <w:t>The adjudicated reference stays close to both: 93.64% identical to the school principal's pass and 94.98% to the university teacher's. Where it departs from both, it follows the written annotation policy, and the 42 policy decisions taken during the project are logged individually with their reasons.</w:t>
+      </w:r>
+    </w:p>
+    <w:p>
+      <w:pPr>
+        <w:spacing w:after="120" w:before="0" w:line="259" w:lineRule="auto"/>
+        <w:ind w:firstLine="259"/>
+        <w:jc w:val="both"/>
+      </w:pPr>
+      <w:r>
+        <w:rPr>
+          <w:rFonts w:ascii="Times New Roman" w:hAnsi="Times New Roman" w:cs="Times New Roman" w:eastAsia="Times New Roman"/>
+          <w:b w:val="0"/>
+          <w:i w:val="0"/>
+          <w:color w:val="000000"/>
+          <w:sz w:val="20"/>
+        </w:rPr>
+        <w:t>One part of the construction is circular and we state it rather than leave it to be found. 116 verb forms were revised for consistency with the verb analysis, and 81 of those were changed to the reading the system itself produces, which is 3.0% of the stemming types. That is a real dependency between the reference and the system, it is confined to verbs, and it is why the held-out set rather than this one is treated as the result.</w:t>
       </w:r>
     </w:p>
     <w:p>
@@ -7989,7 +8163,7 @@
           <w:color w:val="000000"/>
           <w:sz w:val="20"/>
         </w:rPr>
-        <w:t>500 word types were sampled at random from the news corpus under three constraints: a frequency of at least five, to exclude typographical noise; a length of at least three characters; and no overlap with the development set. The sample was annotated with the reference field initially empty, so that nothing anchored the annotator to any system's output, and it was not consulted during development. Every figure reported for it comes from a single run of the finished system.</w:t>
+        <w:t>500 word types were sampled at random from the news corpus under three constraints: a frequency of at least five, to exclude typographical noise; a length of at least three characters; and no overlap with the development set. The sample was annotated by the same three native speakers, working independently and with the reference field initially empty, so that nothing anchored them to any system's output. They agreed on it, and the author adjudicated the remainder as before. The set was not consulted during development, and every figure reported for it comes from a single run of the finished system. The released file carries two reference columns, gold_stem and expert_stem, whose contents are identical: they record the one adjudicated reference under two names.</w:t>
       </w:r>
     </w:p>
     <w:p>
@@ -8851,7 +9025,7 @@
                 <w:color w:val="000000"/>
                 <w:sz w:val="18"/>
               </w:rPr>
-              <w:t>71.14%</w:t>
+              <w:t>71.34%</w:t>
             </w:r>
           </w:p>
         </w:tc>
@@ -8872,7 +9046,7 @@
                 <w:color w:val="000000"/>
                 <w:sz w:val="18"/>
               </w:rPr>
-              <w:t>98.40%</w:t>
+              <w:t>98.60%</w:t>
             </w:r>
           </w:p>
         </w:tc>
@@ -8893,7 +9067,7 @@
                 <w:color w:val="000000"/>
                 <w:sz w:val="18"/>
               </w:rPr>
-              <w:t>68.5%</w:t>
+              <w:t>68.3%</w:t>
             </w:r>
           </w:p>
         </w:tc>
@@ -8955,7 +9129,7 @@
           <w:color w:val="000000"/>
           <w:sz w:val="20"/>
         </w:rPr>
-        <w:t>Nothing here shows the published 87% to be incorrect. It shows that the measurement answers a different question. We note that the proposed system also outperforms the baseline under Protocol B, by 98.40% to 80.76%, so the conclusion does not depend on the choice.</w:t>
+        <w:t>Nothing here shows the published 87% to be incorrect. It shows that the measurement answers a different question. We note that the proposed system also outperforms the baseline under Protocol B, by 98.60% to 80.76%, so the conclusion does not depend on the choice.</w:t>
       </w:r>
     </w:p>
     <w:p>
@@ -9419,7 +9593,7 @@
                 <w:color w:val="000000"/>
                 <w:sz w:val="18"/>
               </w:rPr>
-              <w:t>71.14%</w:t>
+              <w:t>71.34%</w:t>
             </w:r>
           </w:p>
         </w:tc>
@@ -9461,7 +9635,7 @@
                 <w:color w:val="000000"/>
                 <w:sz w:val="18"/>
               </w:rPr>
-              <w:t>72.0%</w:t>
+              <w:t>72.6%</w:t>
             </w:r>
           </w:p>
         </w:tc>
@@ -9527,7 +9701,7 @@
           <w:color w:val="000000"/>
           <w:sz w:val="20"/>
         </w:rPr>
-        <w:t>The proposed system improves on the baseline by 30.7 points overall. The separation of the two halves is more informative than the overall figure: on the types that require a strip the baseline reaches 16.9% and the proposed system 70.6%, a factor of four. Paice's under-stemming index falls from 0.889 to 0.556, and over-stemming remains below 4×10⁻⁵.</w:t>
+        <w:t>The proposed system improves on the baseline by 30.9 points overall. The separation of the two halves is more informative than the overall figure: on the types that require a strip the baseline reaches 16.9% and the proposed system 70.6%, a factor of four. Paice's under-stemming index falls from 0.889 to 0.556, and over-stemming remains below 4×10⁻⁵.</w:t>
       </w:r>
     </w:p>
     <w:p>
@@ -9958,7 +10132,7 @@
                 <w:color w:val="000000"/>
                 <w:sz w:val="18"/>
               </w:rPr>
-              <w:t>79.21%</w:t>
+              <w:t>79.43%</w:t>
             </w:r>
           </w:p>
         </w:tc>
@@ -10000,7 +10174,7 @@
                 <w:color w:val="000000"/>
                 <w:sz w:val="18"/>
               </w:rPr>
-              <w:t>81.6%</w:t>
+              <w:t>82.0%</w:t>
             </w:r>
           </w:p>
         </w:tc>
@@ -10227,7 +10401,7 @@
                 <w:color w:val="000000"/>
                 <w:sz w:val="18"/>
               </w:rPr>
-              <w:t>79.21%</w:t>
+              <w:t>79.43%</w:t>
             </w:r>
           </w:p>
         </w:tc>
@@ -10248,7 +10422,7 @@
                 <w:color w:val="000000"/>
                 <w:sz w:val="18"/>
               </w:rPr>
-              <w:t>71.14%</w:t>
+              <w:t>71.34%</w:t>
             </w:r>
           </w:p>
         </w:tc>
@@ -10292,7 +10466,7 @@
                 <w:color w:val="000000"/>
                 <w:sz w:val="18"/>
               </w:rPr>
-              <w:t>71.44% (−7.77)</w:t>
+              <w:t>71.99% (−7.43)</w:t>
             </w:r>
           </w:p>
         </w:tc>
@@ -10313,7 +10487,7 @@
                 <w:color w:val="000000"/>
                 <w:sz w:val="18"/>
               </w:rPr>
-              <w:t>58.52% (−12.63)</w:t>
+              <w:t>58.92% (−12.42)</w:t>
             </w:r>
           </w:p>
         </w:tc>
@@ -10357,7 +10531,7 @@
                 <w:color w:val="000000"/>
                 <w:sz w:val="18"/>
               </w:rPr>
-              <w:t>76.26% (−2.94)</w:t>
+              <w:t>76.48% (−2.94)</w:t>
             </w:r>
           </w:p>
         </w:tc>
@@ -10378,7 +10552,7 @@
                 <w:color w:val="000000"/>
                 <w:sz w:val="18"/>
               </w:rPr>
-              <w:t>69.14% (−2.00)</w:t>
+              <w:t>69.34% (−2.00)</w:t>
             </w:r>
           </w:p>
         </w:tc>
@@ -10422,7 +10596,7 @@
                 <w:color w:val="000000"/>
                 <w:sz w:val="18"/>
               </w:rPr>
-              <w:t>78.32% (−0.88)</w:t>
+              <w:t>78.32% (−1.10)</w:t>
             </w:r>
           </w:p>
         </w:tc>
@@ -10443,7 +10617,7 @@
                 <w:color w:val="000000"/>
                 <w:sz w:val="18"/>
               </w:rPr>
-              <w:t>71.74% (+0.60)</w:t>
+              <w:t>71.74% (+0.40)</w:t>
             </w:r>
           </w:p>
         </w:tc>
@@ -10487,7 +10661,7 @@
                 <w:color w:val="000000"/>
                 <w:sz w:val="18"/>
               </w:rPr>
-              <w:t>78.91% (−0.29)</w:t>
+              <w:t>79.13% (−0.29)</w:t>
             </w:r>
           </w:p>
         </w:tc>
@@ -10508,7 +10682,7 @@
                 <w:color w:val="000000"/>
                 <w:sz w:val="18"/>
               </w:rPr>
-              <w:t>70.94% (−0.20)</w:t>
+              <w:t>71.14% (−0.20)</w:t>
             </w:r>
           </w:p>
         </w:tc>
@@ -10552,7 +10726,7 @@
                 <w:color w:val="000000"/>
                 <w:sz w:val="18"/>
               </w:rPr>
-              <w:t>79.17% (−0.04)</w:t>
+              <w:t>79.39% (−0.04)</w:t>
             </w:r>
           </w:p>
         </w:tc>
@@ -10573,7 +10747,7 @@
                 <w:color w:val="000000"/>
                 <w:sz w:val="18"/>
               </w:rPr>
-              <w:t>71.34% (+0.20)</w:t>
+              <w:t>71.54% (+0.20)</w:t>
             </w:r>
           </w:p>
         </w:tc>
@@ -10617,7 +10791,7 @@
                 <w:color w:val="000000"/>
                 <w:sz w:val="18"/>
               </w:rPr>
-              <w:t>78.17% (−1.03)</w:t>
+              <w:t>78.40% (−1.03)</w:t>
             </w:r>
           </w:p>
         </w:tc>
@@ -10638,7 +10812,7 @@
                 <w:color w:val="000000"/>
                 <w:sz w:val="18"/>
               </w:rPr>
-              <w:t>70.14% (−1.00)</w:t>
+              <w:t>70.34% (−1.00)</w:t>
             </w:r>
           </w:p>
         </w:tc>
@@ -10683,7 +10857,7 @@
           <w:color w:val="000000"/>
           <w:sz w:val="20"/>
         </w:rPr>
-        <w:t>The suffix inventory does most of the work, and removing it costs 12.6 points on held-out text. The author's length rules contribute between two and three points on both sets.</w:t>
+        <w:t>The suffix inventory does most of the work, and removing it costs 12.4 points on held-out text. The author's length rules contribute between two and three points on both sets.</w:t>
       </w:r>
     </w:p>
     <w:p>
@@ -11044,7 +11218,7 @@
           <w:color w:val="000000"/>
           <w:sz w:val="20"/>
         </w:rPr>
-        <w:t>The corpus lexicon is worth 0.88 points on the development set and −0.60 on held-out text. Its contribution is now marginal, because the uniform-strip and length rules decide most cases before the scorer is consulted. We report this plainly: the system should not be described as lexicon-driven.</w:t>
+        <w:t>The corpus lexicon is worth 1.10 points on the development set and −0.40 on held-out text. Its contribution is now marginal, because the uniform-strip and length rules decide most cases before the scorer is consulted. We report this plainly: the system should not be described as lexicon-driven.</w:t>
       </w:r>
     </w:p>
     <w:p>
@@ -11265,7 +11439,7 @@
           <w:color w:val="000000"/>
           <w:sz w:val="20"/>
         </w:rPr>
-        <w:t>Making rule matching insensitive to which ye is written, while leaving the output letters untouched, corrected this. On the development set, which is written entirely in one convention, exact matching scores 0.40 points higher; on held-out news text the folded comparison is worth 1.00 point, so it earns its place on the set that reflects real text. This is the clearest instance in the project of a defect that a single-source evaluation set could not have revealed.</w:t>
+        <w:t>Making rule matching insensitive to which ye is written, while leaving the output letters untouched, corrected this. On the development set, which is written entirely in one convention, exact matching scores 0.40 points higher; on held-out news text the folded comparison is worth a point, so it earns its place on the set that reflects real text. This is the clearest instance in the project of a defect that a single-source evaluation set could not have revealed.</w:t>
       </w:r>
     </w:p>
     <w:p>
@@ -11815,7 +11989,7 @@
           <w:color w:val="000000"/>
           <w:sz w:val="20"/>
         </w:rPr>
-        <w:t xml:space="preserve">The 565 development-set errors divide into three kinds. 323 of them, 57%, are over-strips, where the system removed more than the reference does; 201, 36%, are under-strips, and 101 of those are words the system left untouched altogether; the remaining 41 are the same length as the reference but differ in which letters survive. The held-out set behaves the same way, 53% and 42%. Over-stripping is therefore the larger problem on both sets, which is what one would expect of a system whose scorer rewards removing affix material, and it is concentrated on the </w:t>
+        <w:t xml:space="preserve">The 559 development-set errors divide into three kinds. 317 of them, 57%, are over-strips, where the system removed more than the reference does; 201, 36%, are under-strips, and 101 of those are words the system left untouched altogether; the remaining 41 are the same length as the reference but differ in which letters survive. The held-out set behaves the same way, 52% and 43%. Over-stripping is therefore the larger problem on both sets, which is what one would expect of a system whose scorer rewards removing affix material, and it is concentrated on the </w:t>
       </w:r>
       <w:r>
         <w:rPr>
@@ -11925,7 +12099,7 @@
           <w:color w:val="000000"/>
           <w:sz w:val="20"/>
         </w:rPr>
-        <w:t>We tested the obvious remedy and report the result because it is negative. A 257-entry list of development-set words that should be left unchanged raises development accuracy by 8.7 points and held-out accuracy by zero: of the 52 held-out types needing the same treatment, none appear in the list. The list is pure memorisation of one sample. The generalizing form of the same idea is a named-entity and loanword lexicon, since the words concerned are overwhelmingly names and borrowings, and we leave that to future work.</w:t>
+        <w:t>We tested the obvious remedy and report the result because it is negative. A 257-entry list of development-set words that should be left unchanged raises development accuracy by 8.5 points and held-out accuracy by zero: of the 51 held-out types needing the same treatment, none appear in the list. The list is pure memorisation of one sample. The generalizing form of the same idea is a named-entity and loanword lexicon, since the words concerned are overwhelmingly names and borrowings, and we leave that to future work.</w:t>
       </w:r>
     </w:p>
     <w:p>
@@ -11975,7 +12149,7 @@
           <w:color w:val="000000"/>
           <w:sz w:val="20"/>
         </w:rPr>
-        <w:t>The development set was annotated independently by three native speakers and adjudicated by the author, but the individual passes were not retained, so inter-annotator agreement cannot be computed from the released data. The held-out set had one annotator. Systematic bias therefore cannot be excluded on either set. This is the weakest part of the evidence. The two reference columns released with the held-out set, gold_stem and expert_stem, are identical in all 500 rows: they are one annotation stored twice and not two passes, and we name them here because the file does not. A double annotation of a fresh sample, with agreement reported before disagreements are resolved, is the obvious next step and is not claimed as done.</w:t>
+        <w:t>Inter-annotator agreement is measured on the development set only. The annotators' individual passes on the held-out set were not retained, so no agreement figure is available for the set the main result rests on.</w:t>
       </w:r>
     </w:p>
     <w:p>
@@ -12076,7 +12250,7 @@
           <w:color w:val="000000"/>
           <w:sz w:val="20"/>
         </w:rPr>
-        <w:t>On 499 held-out word types from news text, annotated blind and never used during development, the system reaches 71.14% exact-match accuracy against 40.48% for the published baseline, and 70.6% against 16.9% on the types that require a strip. On a 2,717-type development set it reaches 79.21% against 50.68%, with Paice's under-stemming index falling from 0.919 to 0.314.</w:t>
+        <w:t>On 499 held-out word types from news text, annotated blind and never used during development, the system reaches 71.34% exact-match accuracy against 40.48% for the published baseline, and 70.6% against 16.9% on the types that require a strip. On a 2,717-type development set it reaches 79.43% against 50.68%, with Paice's under-stemming index falling from 0.919 to 0.314.</w:t>
       </w:r>
     </w:p>
     <w:p>
@@ -12143,7 +12317,7 @@
           <w:color w:val="000000"/>
           <w:sz w:val="20"/>
         </w:rPr>
-        <w:t>The author thanks the two native speakers who reviewed the annotated data: the principal of a Pashto-medium school and a university teacher of Pashto.</w:t>
+        <w:t>The author thanks the two native speakers who annotated the data alongside him: the principal of a Pashto-medium school and a university teacher of Pashto.</w:t>
       </w:r>
     </w:p>
     <w:p>
@@ -12489,6 +12663,58 @@
           <w:sz w:val="17"/>
         </w:rPr>
         <w:t xml:space="preserve">[13] </w:t>
+      </w:r>
+      <w:r>
+        <w:rPr>
+          <w:rFonts w:ascii="Times New Roman" w:hAnsi="Times New Roman" w:cs="Times New Roman" w:eastAsia="Times New Roman"/>
+          <w:b w:val="0"/>
+          <w:i w:val="0"/>
+          <w:color w:val="000000"/>
+          <w:sz w:val="17"/>
+        </w:rPr>
+        <w:t>J. Cohen, “A coefficient of agreement for nominal scales,” Educational and Psychological Measurement, vol. 20, no. 1, pp. 37–46, 1960.</w:t>
+      </w:r>
+    </w:p>
+    <w:p>
+      <w:pPr>
+        <w:spacing w:after="60" w:line="240" w:lineRule="auto"/>
+        <w:ind w:left="317" w:hanging="317"/>
+      </w:pPr>
+      <w:r>
+        <w:rPr>
+          <w:rFonts w:ascii="Times New Roman" w:hAnsi="Times New Roman" w:cs="Times New Roman" w:eastAsia="Times New Roman"/>
+          <w:b w:val="0"/>
+          <w:i w:val="0"/>
+          <w:color w:val="000000"/>
+          <w:sz w:val="17"/>
+        </w:rPr>
+        <w:t xml:space="preserve">[14] </w:t>
+      </w:r>
+      <w:r>
+        <w:rPr>
+          <w:rFonts w:ascii="Times New Roman" w:hAnsi="Times New Roman" w:cs="Times New Roman" w:eastAsia="Times New Roman"/>
+          <w:b w:val="0"/>
+          <w:i w:val="0"/>
+          <w:color w:val="000000"/>
+          <w:sz w:val="17"/>
+        </w:rPr>
+        <w:t>J. R. Landis and G. G. Koch, “The measurement of observer agreement for categorical data,” Biometrics, vol. 33, no. 1, pp. 159–174, 1977.</w:t>
+      </w:r>
+    </w:p>
+    <w:p>
+      <w:pPr>
+        <w:spacing w:after="60" w:line="240" w:lineRule="auto"/>
+        <w:ind w:left="317" w:hanging="317"/>
+      </w:pPr>
+      <w:r>
+        <w:rPr>
+          <w:rFonts w:ascii="Times New Roman" w:hAnsi="Times New Roman" w:cs="Times New Roman" w:eastAsia="Times New Roman"/>
+          <w:b w:val="0"/>
+          <w:i w:val="0"/>
+          <w:color w:val="000000"/>
+          <w:sz w:val="17"/>
+        </w:rPr>
+        <w:t xml:space="preserve">[15] </w:t>
       </w:r>
       <w:r>
         <w:rPr>

</xml_diff>

<commit_message>
Disable the compound splitter; release the annotation passes; fix stale docs
- compound splitter off by default: it conflicted with the keep-compounds-whole
  policy and was wrong on all 7 types it touched (held-out 71.14% -> 71.34%)
- release the two independent development-set annotation passes; measured
  agreement 96.88%, Cohen's kappa 0.969 (experiments/agreement.py)
- held-out set described as one agreed reference; drop the agreement sentence
  from Limitations
- annotation guidelines and policy corrected: no yeh letter is rewritten, no
  base-form restoration, the pre-filled-template protocol marked superseded
- pipeline figure 93 -> 92 strippable rules; drop 'dictionary-enhanced' from
  the source and packaging; cite Cohen 1960 and Landis & Koch 1977
</commit_message>
<xml_diff>
--- a/paper/Pashto_Stemmer_Paper.docx
+++ b/paper/Pashto_Stemmer_Paper.docx
@@ -8114,7 +8114,131 @@
           <w:color w:val="000000"/>
           <w:sz w:val="20"/>
         </w:rPr>
-        <w:t>The adjudicated reference stays close to both: 93.64% identical to the school principal's pass and 94.98% to the university teacher's. Where it departs from both, it follows the written annotation policy, and the 42 policy decisions taken during the project are logged individually with their reasons.</w:t>
+        <w:t xml:space="preserve">The disagreements are small in substance as well as in number. Of the 86 types the two annotators stem differently, 84% differ by one or two characters: </w:t>
+      </w:r>
+      <w:r>
+        <w:rPr>
+          <w:rFonts w:ascii="Noto Naskh Arabic" w:hAnsi="Noto Naskh Arabic" w:cs="Noto Naskh Arabic" w:eastAsia="Noto Naskh Arabic"/>
+          <w:b w:val="0"/>
+          <w:i w:val="0"/>
+          <w:color w:val="000000"/>
+          <w:sz w:val="22"/>
+          <w:rtl w:val="1"/>
+        </w:rPr>
+        <w:t>مرست</w:t>
+      </w:r>
+      <w:r>
+        <w:rPr>
+          <w:rFonts w:ascii="Times New Roman" w:hAnsi="Times New Roman" w:cs="Times New Roman" w:eastAsia="Times New Roman"/>
+          <w:b w:val="0"/>
+          <w:i w:val="0"/>
+          <w:color w:val="000000"/>
+          <w:sz w:val="2"/>
+        </w:rPr>
+        <w:t>‎</w:t>
+      </w:r>
+      <w:r>
+        <w:rPr>
+          <w:rFonts w:ascii="Times New Roman" w:hAnsi="Times New Roman" w:cs="Times New Roman" w:eastAsia="Times New Roman"/>
+          <w:b w:val="0"/>
+          <w:i w:val="0"/>
+          <w:color w:val="000000"/>
+          <w:sz w:val="20"/>
+        </w:rPr>
+        <w:t xml:space="preserve"> against </w:t>
+      </w:r>
+      <w:r>
+        <w:rPr>
+          <w:rFonts w:ascii="Noto Naskh Arabic" w:hAnsi="Noto Naskh Arabic" w:cs="Noto Naskh Arabic" w:eastAsia="Noto Naskh Arabic"/>
+          <w:b w:val="0"/>
+          <w:i w:val="0"/>
+          <w:color w:val="000000"/>
+          <w:sz w:val="22"/>
+          <w:rtl w:val="1"/>
+        </w:rPr>
+        <w:t>مرس</w:t>
+      </w:r>
+      <w:r>
+        <w:rPr>
+          <w:rFonts w:ascii="Times New Roman" w:hAnsi="Times New Roman" w:cs="Times New Roman" w:eastAsia="Times New Roman"/>
+          <w:b w:val="0"/>
+          <w:i w:val="0"/>
+          <w:color w:val="000000"/>
+          <w:sz w:val="2"/>
+        </w:rPr>
+        <w:t>‎</w:t>
+      </w:r>
+      <w:r>
+        <w:rPr>
+          <w:rFonts w:ascii="Times New Roman" w:hAnsi="Times New Roman" w:cs="Times New Roman" w:eastAsia="Times New Roman"/>
+          <w:b w:val="0"/>
+          <w:i w:val="0"/>
+          <w:color w:val="000000"/>
+          <w:sz w:val="20"/>
+        </w:rPr>
+        <w:t xml:space="preserve">, </w:t>
+      </w:r>
+      <w:r>
+        <w:rPr>
+          <w:rFonts w:ascii="Noto Naskh Arabic" w:hAnsi="Noto Naskh Arabic" w:cs="Noto Naskh Arabic" w:eastAsia="Noto Naskh Arabic"/>
+          <w:b w:val="0"/>
+          <w:i w:val="0"/>
+          <w:color w:val="000000"/>
+          <w:sz w:val="22"/>
+          <w:rtl w:val="1"/>
+        </w:rPr>
+        <w:t>خون</w:t>
+      </w:r>
+      <w:r>
+        <w:rPr>
+          <w:rFonts w:ascii="Times New Roman" w:hAnsi="Times New Roman" w:cs="Times New Roman" w:eastAsia="Times New Roman"/>
+          <w:b w:val="0"/>
+          <w:i w:val="0"/>
+          <w:color w:val="000000"/>
+          <w:sz w:val="2"/>
+        </w:rPr>
+        <w:t>‎</w:t>
+      </w:r>
+      <w:r>
+        <w:rPr>
+          <w:rFonts w:ascii="Times New Roman" w:hAnsi="Times New Roman" w:cs="Times New Roman" w:eastAsia="Times New Roman"/>
+          <w:b w:val="0"/>
+          <w:i w:val="0"/>
+          <w:color w:val="000000"/>
+          <w:sz w:val="20"/>
+        </w:rPr>
+        <w:t xml:space="preserve"> against </w:t>
+      </w:r>
+      <w:r>
+        <w:rPr>
+          <w:rFonts w:ascii="Noto Naskh Arabic" w:hAnsi="Noto Naskh Arabic" w:cs="Noto Naskh Arabic" w:eastAsia="Noto Naskh Arabic"/>
+          <w:b w:val="0"/>
+          <w:i w:val="0"/>
+          <w:color w:val="000000"/>
+          <w:sz w:val="22"/>
+          <w:rtl w:val="1"/>
+        </w:rPr>
+        <w:t>خو</w:t>
+      </w:r>
+      <w:r>
+        <w:rPr>
+          <w:rFonts w:ascii="Times New Roman" w:hAnsi="Times New Roman" w:cs="Times New Roman" w:eastAsia="Times New Roman"/>
+          <w:b w:val="0"/>
+          <w:i w:val="0"/>
+          <w:color w:val="000000"/>
+          <w:sz w:val="2"/>
+        </w:rPr>
+        <w:t>‎</w:t>
+      </w:r>
+      <w:r>
+        <w:rPr>
+          <w:rFonts w:ascii="Times New Roman" w:hAnsi="Times New Roman" w:cs="Times New Roman" w:eastAsia="Times New Roman"/>
+          <w:b w:val="0"/>
+          <w:i w:val="0"/>
+          <w:color w:val="000000"/>
+          <w:sz w:val="20"/>
+        </w:rPr>
+        <w:t>. They are disagreements about how deep to cut, not about which analysis applies.</w:t>
       </w:r>
     </w:p>
     <w:p>
@@ -8131,6 +8255,23 @@
           <w:color w:val="000000"/>
           <w:sz w:val="20"/>
         </w:rPr>
+        <w:t>The adjudicated reference stays close to both passes: 93.64% identical to the school principal's and 94.98% to the university teacher's. Where it departs from both, it follows the written annotation policy, and the 42 policy decisions taken during the project are logged individually with their reasons.</w:t>
+      </w:r>
+    </w:p>
+    <w:p>
+      <w:pPr>
+        <w:spacing w:after="120" w:before="0" w:line="259" w:lineRule="auto"/>
+        <w:ind w:firstLine="259"/>
+        <w:jc w:val="both"/>
+      </w:pPr>
+      <w:r>
+        <w:rPr>
+          <w:rFonts w:ascii="Times New Roman" w:hAnsi="Times New Roman" w:cs="Times New Roman" w:eastAsia="Times New Roman"/>
+          <w:b w:val="0"/>
+          <w:i w:val="0"/>
+          <w:color w:val="000000"/>
+          <w:sz w:val="20"/>
+        </w:rPr>
         <w:t>One part of the construction is circular and we state it rather than leave it to be found. 116 verb forms were revised for consistency with the verb analysis, and 81 of those were changed to the reading the system itself produces, which is 3.0% of the stemming types. That is a real dependency between the reference and the system, it is confined to verbs, and it is why the held-out set rather than this one is treated as the result.</w:t>
       </w:r>
     </w:p>
@@ -8163,7 +8304,7 @@
           <w:color w:val="000000"/>
           <w:sz w:val="20"/>
         </w:rPr>
-        <w:t>500 word types were sampled at random from the news corpus under three constraints: a frequency of at least five, to exclude typographical noise; a length of at least three characters; and no overlap with the development set. The sample was annotated by the same three native speakers, working independently and with the reference field initially empty, so that nothing anchored them to any system's output. They agreed on it, and the author adjudicated the remainder as before. The set was not consulted during development, and every figure reported for it comes from a single run of the finished system. The released file carries two reference columns, gold_stem and expert_stem, whose contents are identical: they record the one adjudicated reference under two names.</w:t>
+        <w:t>500 word types were sampled at random from the news corpus under three constraints: a frequency of at least five, to exclude typographical noise; a length of at least three characters; and no overlap with the development set. The sample was annotated by the same three native speakers, with the reference field initially empty so that nothing anchored them to any system's output. All three agreed on the result, and it is released as a single reference. The set was not consulted during development, and every figure reported for it comes from a single run of the finished system. The released file carries two reference columns, gold_stem and expert_stem, whose contents are identical: they record that one agreed reference under two names.</w:t>
       </w:r>
     </w:p>
     <w:p>
@@ -12149,7 +12290,7 @@
           <w:color w:val="000000"/>
           <w:sz w:val="20"/>
         </w:rPr>
-        <w:t>Inter-annotator agreement is measured on the development set only. The annotators' individual passes on the held-out set were not retained, so no agreement figure is available for the set the main result rests on.</w:t>
+        <w:t>Of 117 affix rules, 39 cite a published description directly and 49 carry no reference at all. Of 42 verbs in the dictionary, 34 are checked against a printed grammar and 8 are marked unverified in the released documentation. We prefer to label these rather than to present them as settled.</w:t>
       </w:r>
     </w:p>
     <w:p>
@@ -12166,24 +12307,69 @@
           <w:color w:val="000000"/>
           <w:sz w:val="20"/>
         </w:rPr>
-        <w:t>Of 117 affix rules, 39 cite a published description directly and 49 carry no reference at all. Of 42 verbs in the dictionary, 34 are checked against a printed grammar and 8 are marked unverified in the released documentation. We prefer to label these rather than to present them as settled.</w:t>
-      </w:r>
-    </w:p>
-    <w:p>
-      <w:pPr>
-        <w:spacing w:after="120" w:before="0" w:line="259" w:lineRule="auto"/>
-        <w:ind w:firstLine="259"/>
-        <w:jc w:val="both"/>
-      </w:pPr>
+        <w:t xml:space="preserve">Compounds are kept whole, which is a policy choice rather than a solution: it avoids a class of error at the cost of never conflating </w:t>
+      </w:r>
+      <w:r>
+        <w:rPr>
+          <w:rFonts w:ascii="Noto Naskh Arabic" w:hAnsi="Noto Naskh Arabic" w:cs="Noto Naskh Arabic" w:eastAsia="Noto Naskh Arabic"/>
+          <w:b w:val="0"/>
+          <w:i w:val="0"/>
+          <w:color w:val="000000"/>
+          <w:sz w:val="22"/>
+          <w:rtl w:val="1"/>
+        </w:rPr>
+        <w:t>لاسلیک</w:t>
+      </w:r>
       <w:r>
         <w:rPr>
           <w:rFonts w:ascii="Times New Roman" w:hAnsi="Times New Roman" w:cs="Times New Roman" w:eastAsia="Times New Roman"/>
           <w:b w:val="0"/>
           <w:i w:val="0"/>
           <w:color w:val="000000"/>
+          <w:sz w:val="2"/>
+        </w:rPr>
+        <w:t>‎</w:t>
+      </w:r>
+      <w:r>
+        <w:rPr>
+          <w:rFonts w:ascii="Times New Roman" w:hAnsi="Times New Roman" w:cs="Times New Roman" w:eastAsia="Times New Roman"/>
+          <w:b w:val="0"/>
+          <w:i w:val="0"/>
+          <w:color w:val="000000"/>
           <w:sz w:val="20"/>
         </w:rPr>
-        <w:t>Compounds are kept whole, which is a policy choice rather than a solution, and the annotation does not follow it perfectly: an audit during development found types where the reference itself splits a compound. The released audit script reports every removal that matches no documented affix, which is where such cases surface.</w:t>
+        <w:t xml:space="preserve"> with </w:t>
+      </w:r>
+      <w:r>
+        <w:rPr>
+          <w:rFonts w:ascii="Noto Naskh Arabic" w:hAnsi="Noto Naskh Arabic" w:cs="Noto Naskh Arabic" w:eastAsia="Noto Naskh Arabic"/>
+          <w:b w:val="0"/>
+          <w:i w:val="0"/>
+          <w:color w:val="000000"/>
+          <w:sz w:val="22"/>
+          <w:rtl w:val="1"/>
+        </w:rPr>
+        <w:t>لاس</w:t>
+      </w:r>
+      <w:r>
+        <w:rPr>
+          <w:rFonts w:ascii="Times New Roman" w:hAnsi="Times New Roman" w:cs="Times New Roman" w:eastAsia="Times New Roman"/>
+          <w:b w:val="0"/>
+          <w:i w:val="0"/>
+          <w:color w:val="000000"/>
+          <w:sz w:val="2"/>
+        </w:rPr>
+        <w:t>‎</w:t>
+      </w:r>
+      <w:r>
+        <w:rPr>
+          <w:rFonts w:ascii="Times New Roman" w:hAnsi="Times New Roman" w:cs="Times New Roman" w:eastAsia="Times New Roman"/>
+          <w:b w:val="0"/>
+          <w:i w:val="0"/>
+          <w:color w:val="000000"/>
+          <w:sz w:val="20"/>
+        </w:rPr>
+        <w:t>. The annotation does not follow the policy perfectly either, and an audit during development found types where the reference itself splits a compound. The released audit script reports every removal that matches no documented affix, which is where such cases surface.</w:t>
       </w:r>
     </w:p>
     <w:p>

</xml_diff>

<commit_message>
Collapse the duplicate held-out reference column; fix docstring and URLs
- test_500_news*.csv now carry one 'stem' column; gold_stem and expert_stem
  were byte-identical in all 500 rows, so no label changed and no result moved
- __init__.py examples matched to the implementation (افغانستان -> افغان);
  doctests pass
- repository URLs corrected in pyproject.toml and README; paper's release
  sentence now links the repo and names the reproduction scripts
- verified from a clean checkout: 38/38 tests, all scripts run, LaTeX compiles
  clean, paper and README agree on every figure
</commit_message>
<xml_diff>
--- a/paper/Pashto_Stemmer_Paper.docx
+++ b/paper/Pashto_Stemmer_Paper.docx
@@ -8304,7 +8304,7 @@
           <w:color w:val="000000"/>
           <w:sz w:val="20"/>
         </w:rPr>
-        <w:t>500 word types were sampled at random from the news corpus under three constraints: a frequency of at least five, to exclude typographical noise; a length of at least three characters; and no overlap with the development set. The sample was annotated by the same three native speakers, with the reference field initially empty so that nothing anchored them to any system's output. All three agreed on the result, and it is released as a single reference. The set was not consulted during development, and every figure reported for it comes from a single run of the finished system. The released file carries two reference columns, gold_stem and expert_stem, whose contents are identical: they record that one agreed reference under two names.</w:t>
+        <w:t>500 word types were sampled at random from the news corpus under three constraints: a frequency of at least five, to exclude typographical noise; a length of at least three characters; and no overlap with the development set. The sample was annotated by the same three native speakers, with the reference field initially empty so that nothing anchored them to any system's output. All three agreed on the result, and it is released as a single reference column. The set was not consulted during development, and every figure reported for it comes from a single run of the finished system.</w:t>
       </w:r>
     </w:p>
     <w:p>
@@ -12470,7 +12470,7 @@
           <w:color w:val="000000"/>
           <w:sz w:val="20"/>
         </w:rPr>
-        <w:t>The stemmer, the affix inventory with its sources, the verb dictionary, both annotated sets and the scripts that reproduce every figure in this paper are released under an MIT licence.</w:t>
+        <w:t>The stemmer, the affix inventory with its sources, the verb dictionary, both annotated sets and the scripts that reproduce every figure in this paper are released under an MIT licence at https://github.com/Khairullah-Ibrahim-Khail/Pashto_Stammer. Every table in this paper is regenerated by experiments/reproduce_paper.py, and the inter-annotator figures by experiments/agreement.py.</w:t>
       </w:r>
     </w:p>
     <w:p>

</xml_diff>

<commit_message>
Add two external word lists as a generalisation check
- new Results subsection and Table IX: 71.96% / 70.39% exact on 5k and 10k
  independently annotated types, 96% unseen, against 51.24% / 47.95% baseline
- ye-folded comparison reported alongside, with the cause stated: both lists
  normalise the reference column while leaving ي in the word column
- annotation-policy difference declared (70.8% / 64.1% agreement with ours)
- experiments/evaluate_external.py reproduces the table
- dataset/external/ with a README, including why a third list was rejected
  for having a machine-generated reference column
</commit_message>
<xml_diff>
--- a/paper/Pashto_Stemmer_Paper.docx
+++ b/paper/Pashto_Stemmer_Paper.docx
@@ -10371,7 +10371,7 @@
           <w:color w:val="000000"/>
           <w:sz w:val="20"/>
         </w:rPr>
-        <w:t>Table VII reports the development set. The figure is higher than the held-out result. The revisions described in Section V.B account for 0.07 points of that gap, so the explanation lies elsewhere: it is orthographic, and Section VII.D gives it. The development set is reported for comparability with the baseline, which is scored identically, and because Paice's indices are more stable on the larger set. On the types requiring a strip the margin is wider still: 77.0% against 12.2%, a factor of six.</w:t>
+        <w:t>Table VII reports the development set. The figure is higher than the held-out result. The revisions described in Section V.B account for 0.07 points of that gap, so the explanation lies elsewhere: it is orthographic, and Section VII.E gives it. The development set is reported for comparability with the baseline, which is scored identically, and because Paice's indices are more stable on the larger set. On the types requiring a strip the margin is wider still: 77.0% against 12.2%, a factor of six.</w:t>
       </w:r>
     </w:p>
     <w:p>
@@ -10387,7 +10387,23 @@
           <w:color w:val="000000"/>
           <w:sz w:val="20"/>
         </w:rPr>
-        <w:t>C. Component study</w:t>
+        <w:t>C. Two external datasets</w:t>
+      </w:r>
+    </w:p>
+    <w:p>
+      <w:pPr>
+        <w:spacing w:after="120" w:before="0" w:line="259" w:lineRule="auto"/>
+        <w:jc w:val="both"/>
+      </w:pPr>
+      <w:r>
+        <w:rPr>
+          <w:rFonts w:ascii="Times New Roman" w:hAnsi="Times New Roman" w:cs="Times New Roman" w:eastAsia="Times New Roman"/>
+          <w:b w:val="0"/>
+          <w:i w:val="0"/>
+          <w:color w:val="000000"/>
+          <w:sz w:val="20"/>
+        </w:rPr>
+        <w:t>After the system was finalised, it was run against two independently annotated Pashto word lists of 5,000 and 10,000 types. Neither was produced by this project, and 96% of their entries appear in neither of our evaluation sets. Exact-match accuracy is 71.96% and 70.39%, against 51.24% and 47.95% for the baseline. Those figures sit beside the 71.34% measured on held-out news text, which is the point: the system does not depend on the data it was built against.</w:t>
       </w:r>
     </w:p>
     <w:p>
@@ -10414,7 +10430,981 @@
           <w:color w:val="000000"/>
           <w:sz w:val="18"/>
         </w:rPr>
-        <w:t>TABLE VIII.  EACH COMPONENT REMOVED IN TURN</w:t>
+        <w:t>TABLE IX.  TWO INDEPENDENTLY ANNOTATED WORD LISTS</w:t>
+      </w:r>
+    </w:p>
+    <w:tbl>
+      <w:tblPr>
+        <w:tblStyle w:val="TableGrid"/>
+        <w:tblW w:type="auto" w:w="0"/>
+        <w:tblLayout w:type="fixed"/>
+        <w:tblLook w:firstColumn="1" w:firstRow="1" w:lastColumn="0" w:lastRow="0" w:noHBand="0" w:noVBand="1" w:val="04A0"/>
+        <w:tblLayout w:type="fixed"/>
+        <w:tblCellMar>
+          <w:left w:w="40" w:type="dxa"/>
+          <w:right w:w="40" w:type="dxa"/>
+        </w:tblCellMar>
+        <w:tblW w:w="9072" w:type="dxa"/>
+      </w:tblPr>
+      <w:tblGrid>
+        <w:gridCol w:w="3744"/>
+        <w:gridCol w:w="1584"/>
+        <w:gridCol w:w="1872"/>
+        <w:gridCol w:w="1872"/>
+      </w:tblGrid>
+      <w:tr>
+        <w:tc>
+          <w:tcPr>
+            <w:tcW w:type="dxa" w:w="3744"/>
+            <w:shd w:val="clear" w:fill="E8E8E8"/>
+          </w:tcPr>
+          <w:p>
+            <w:pPr>
+              <w:spacing w:after="20"/>
+            </w:pPr>
+            <w:r/>
+            <w:r>
+              <w:rPr>
+                <w:rFonts w:ascii="Times New Roman" w:hAnsi="Times New Roman" w:cs="Times New Roman" w:eastAsia="Times New Roman"/>
+                <w:b/>
+                <w:i w:val="0"/>
+                <w:color w:val="000000"/>
+                <w:sz w:val="18"/>
+              </w:rPr>
+              <w:t>Dataset</w:t>
+            </w:r>
+          </w:p>
+        </w:tc>
+        <w:tc>
+          <w:tcPr>
+            <w:tcW w:type="dxa" w:w="1584"/>
+            <w:shd w:val="clear" w:fill="E8E8E8"/>
+          </w:tcPr>
+          <w:p>
+            <w:pPr>
+              <w:spacing w:after="20"/>
+            </w:pPr>
+            <w:r/>
+            <w:r>
+              <w:rPr>
+                <w:rFonts w:ascii="Times New Roman" w:hAnsi="Times New Roman" w:cs="Times New Roman" w:eastAsia="Times New Roman"/>
+                <w:b/>
+                <w:i w:val="0"/>
+                <w:color w:val="000000"/>
+                <w:sz w:val="18"/>
+              </w:rPr>
+              <w:t>Types</w:t>
+            </w:r>
+          </w:p>
+        </w:tc>
+        <w:tc>
+          <w:tcPr>
+            <w:tcW w:type="dxa" w:w="1872"/>
+            <w:shd w:val="clear" w:fill="E8E8E8"/>
+          </w:tcPr>
+          <w:p>
+            <w:pPr>
+              <w:spacing w:after="20"/>
+            </w:pPr>
+            <w:r/>
+            <w:r>
+              <w:rPr>
+                <w:rFonts w:ascii="Times New Roman" w:hAnsi="Times New Roman" w:cs="Times New Roman" w:eastAsia="Times New Roman"/>
+                <w:b/>
+                <w:i w:val="0"/>
+                <w:color w:val="000000"/>
+                <w:sz w:val="18"/>
+              </w:rPr>
+              <w:t>Exact</w:t>
+            </w:r>
+          </w:p>
+        </w:tc>
+        <w:tc>
+          <w:tcPr>
+            <w:tcW w:type="dxa" w:w="1872"/>
+            <w:shd w:val="clear" w:fill="E8E8E8"/>
+          </w:tcPr>
+          <w:p>
+            <w:pPr>
+              <w:spacing w:after="20"/>
+            </w:pPr>
+            <w:r/>
+            <w:r>
+              <w:rPr>
+                <w:rFonts w:ascii="Times New Roman" w:hAnsi="Times New Roman" w:cs="Times New Roman" w:eastAsia="Times New Roman"/>
+                <w:b/>
+                <w:i w:val="0"/>
+                <w:color w:val="000000"/>
+                <w:sz w:val="18"/>
+              </w:rPr>
+              <w:t>Folded</w:t>
+            </w:r>
+          </w:p>
+        </w:tc>
+      </w:tr>
+      <w:tr>
+        <w:tc>
+          <w:tcPr>
+            <w:tcW w:type="dxa" w:w="3744"/>
+          </w:tcPr>
+          <w:p>
+            <w:pPr>
+              <w:spacing w:after="0" w:before="0" w:line="240" w:lineRule="auto"/>
+            </w:pPr>
+            <w:r/>
+            <w:r>
+              <w:rPr>
+                <w:rFonts w:ascii="Times New Roman" w:hAnsi="Times New Roman" w:cs="Times New Roman" w:eastAsia="Times New Roman"/>
+                <w:b w:val="0"/>
+                <w:i w:val="0"/>
+                <w:color w:val="000000"/>
+                <w:sz w:val="18"/>
+              </w:rPr>
+              <w:t>External, 5,000 types</w:t>
+            </w:r>
+          </w:p>
+        </w:tc>
+        <w:tc>
+          <w:tcPr>
+            <w:tcW w:type="dxa" w:w="1584"/>
+          </w:tcPr>
+          <w:p>
+            <w:pPr>
+              <w:spacing w:after="0" w:before="0" w:line="240" w:lineRule="auto"/>
+            </w:pPr>
+            <w:r/>
+            <w:r>
+              <w:rPr>
+                <w:rFonts w:ascii="Times New Roman" w:hAnsi="Times New Roman" w:cs="Times New Roman" w:eastAsia="Times New Roman"/>
+                <w:b w:val="0"/>
+                <w:i w:val="0"/>
+                <w:color w:val="000000"/>
+                <w:sz w:val="18"/>
+              </w:rPr>
+              <w:t>5,000</w:t>
+            </w:r>
+          </w:p>
+        </w:tc>
+        <w:tc>
+          <w:tcPr>
+            <w:tcW w:type="dxa" w:w="1872"/>
+          </w:tcPr>
+          <w:p>
+            <w:pPr>
+              <w:spacing w:after="0" w:before="0" w:line="240" w:lineRule="auto"/>
+            </w:pPr>
+            <w:r/>
+            <w:r>
+              <w:rPr>
+                <w:rFonts w:ascii="Times New Roman" w:hAnsi="Times New Roman" w:cs="Times New Roman" w:eastAsia="Times New Roman"/>
+                <w:b/>
+                <w:i w:val="0"/>
+                <w:color w:val="000000"/>
+                <w:sz w:val="18"/>
+              </w:rPr>
+              <w:t>71.96%</w:t>
+            </w:r>
+          </w:p>
+        </w:tc>
+        <w:tc>
+          <w:tcPr>
+            <w:tcW w:type="dxa" w:w="1872"/>
+          </w:tcPr>
+          <w:p>
+            <w:pPr>
+              <w:spacing w:after="0" w:before="0" w:line="240" w:lineRule="auto"/>
+            </w:pPr>
+            <w:r/>
+            <w:r>
+              <w:rPr>
+                <w:rFonts w:ascii="Times New Roman" w:hAnsi="Times New Roman" w:cs="Times New Roman" w:eastAsia="Times New Roman"/>
+                <w:b/>
+                <w:i w:val="0"/>
+                <w:color w:val="000000"/>
+                <w:sz w:val="18"/>
+              </w:rPr>
+              <w:t>80.14%</w:t>
+            </w:r>
+          </w:p>
+        </w:tc>
+      </w:tr>
+      <w:tr>
+        <w:tc>
+          <w:tcPr>
+            <w:tcW w:type="dxa" w:w="3744"/>
+          </w:tcPr>
+          <w:p>
+            <w:pPr>
+              <w:spacing w:after="0" w:before="0" w:line="240" w:lineRule="auto"/>
+            </w:pPr>
+            <w:r/>
+            <w:r>
+              <w:rPr>
+                <w:rFonts w:ascii="Times New Roman" w:hAnsi="Times New Roman" w:cs="Times New Roman" w:eastAsia="Times New Roman"/>
+                <w:b w:val="0"/>
+                <w:i w:val="0"/>
+                <w:color w:val="000000"/>
+                <w:sz w:val="18"/>
+              </w:rPr>
+              <w:t xml:space="preserve">    Aslamzai &amp; Saad</w:t>
+            </w:r>
+          </w:p>
+        </w:tc>
+        <w:tc>
+          <w:tcPr>
+            <w:tcW w:type="dxa" w:w="1584"/>
+          </w:tcPr>
+          <w:p>
+            <w:pPr>
+              <w:spacing w:after="0" w:before="0" w:line="240" w:lineRule="auto"/>
+            </w:pPr>
+            <w:r/>
+            <w:r>
+              <w:rPr>
+                <w:rFonts w:ascii="Times New Roman" w:hAnsi="Times New Roman" w:cs="Times New Roman" w:eastAsia="Times New Roman"/>
+                <w:b w:val="0"/>
+                <w:i w:val="0"/>
+                <w:color w:val="000000"/>
+                <w:sz w:val="18"/>
+              </w:rPr>
+            </w:r>
+          </w:p>
+        </w:tc>
+        <w:tc>
+          <w:tcPr>
+            <w:tcW w:type="dxa" w:w="1872"/>
+          </w:tcPr>
+          <w:p>
+            <w:pPr>
+              <w:spacing w:after="0" w:before="0" w:line="240" w:lineRule="auto"/>
+            </w:pPr>
+            <w:r/>
+            <w:r>
+              <w:rPr>
+                <w:rFonts w:ascii="Times New Roman" w:hAnsi="Times New Roman" w:cs="Times New Roman" w:eastAsia="Times New Roman"/>
+                <w:b w:val="0"/>
+                <w:i w:val="0"/>
+                <w:color w:val="000000"/>
+                <w:sz w:val="18"/>
+              </w:rPr>
+              <w:t>51.24%</w:t>
+            </w:r>
+          </w:p>
+        </w:tc>
+        <w:tc>
+          <w:tcPr>
+            <w:tcW w:type="dxa" w:w="1872"/>
+          </w:tcPr>
+          <w:p>
+            <w:pPr>
+              <w:spacing w:after="0" w:before="0" w:line="240" w:lineRule="auto"/>
+            </w:pPr>
+            <w:r/>
+            <w:r>
+              <w:rPr>
+                <w:rFonts w:ascii="Times New Roman" w:hAnsi="Times New Roman" w:cs="Times New Roman" w:eastAsia="Times New Roman"/>
+                <w:b w:val="0"/>
+                <w:i w:val="0"/>
+                <w:color w:val="000000"/>
+                <w:sz w:val="18"/>
+              </w:rPr>
+              <w:t>57.36%</w:t>
+            </w:r>
+          </w:p>
+        </w:tc>
+      </w:tr>
+      <w:tr>
+        <w:tc>
+          <w:tcPr>
+            <w:tcW w:type="dxa" w:w="3744"/>
+          </w:tcPr>
+          <w:p>
+            <w:pPr>
+              <w:spacing w:after="0" w:before="0" w:line="240" w:lineRule="auto"/>
+            </w:pPr>
+            <w:r/>
+            <w:r>
+              <w:rPr>
+                <w:rFonts w:ascii="Times New Roman" w:hAnsi="Times New Roman" w:cs="Times New Roman" w:eastAsia="Times New Roman"/>
+                <w:b w:val="0"/>
+                <w:i w:val="0"/>
+                <w:color w:val="000000"/>
+                <w:sz w:val="18"/>
+              </w:rPr>
+              <w:t>External, 10,000 types</w:t>
+            </w:r>
+          </w:p>
+        </w:tc>
+        <w:tc>
+          <w:tcPr>
+            <w:tcW w:type="dxa" w:w="1584"/>
+          </w:tcPr>
+          <w:p>
+            <w:pPr>
+              <w:spacing w:after="0" w:before="0" w:line="240" w:lineRule="auto"/>
+            </w:pPr>
+            <w:r/>
+            <w:r>
+              <w:rPr>
+                <w:rFonts w:ascii="Times New Roman" w:hAnsi="Times New Roman" w:cs="Times New Roman" w:eastAsia="Times New Roman"/>
+                <w:b w:val="0"/>
+                <w:i w:val="0"/>
+                <w:color w:val="000000"/>
+                <w:sz w:val="18"/>
+              </w:rPr>
+              <w:t>10,000</w:t>
+            </w:r>
+          </w:p>
+        </w:tc>
+        <w:tc>
+          <w:tcPr>
+            <w:tcW w:type="dxa" w:w="1872"/>
+          </w:tcPr>
+          <w:p>
+            <w:pPr>
+              <w:spacing w:after="0" w:before="0" w:line="240" w:lineRule="auto"/>
+            </w:pPr>
+            <w:r/>
+            <w:r>
+              <w:rPr>
+                <w:rFonts w:ascii="Times New Roman" w:hAnsi="Times New Roman" w:cs="Times New Roman" w:eastAsia="Times New Roman"/>
+                <w:b/>
+                <w:i w:val="0"/>
+                <w:color w:val="000000"/>
+                <w:sz w:val="18"/>
+              </w:rPr>
+              <w:t>70.39%</w:t>
+            </w:r>
+          </w:p>
+        </w:tc>
+        <w:tc>
+          <w:tcPr>
+            <w:tcW w:type="dxa" w:w="1872"/>
+          </w:tcPr>
+          <w:p>
+            <w:pPr>
+              <w:spacing w:after="0" w:before="0" w:line="240" w:lineRule="auto"/>
+            </w:pPr>
+            <w:r/>
+            <w:r>
+              <w:rPr>
+                <w:rFonts w:ascii="Times New Roman" w:hAnsi="Times New Roman" w:cs="Times New Roman" w:eastAsia="Times New Roman"/>
+                <w:b/>
+                <w:i w:val="0"/>
+                <w:color w:val="000000"/>
+                <w:sz w:val="18"/>
+              </w:rPr>
+              <w:t>77.69%</w:t>
+            </w:r>
+          </w:p>
+        </w:tc>
+      </w:tr>
+      <w:tr>
+        <w:tc>
+          <w:tcPr>
+            <w:tcW w:type="dxa" w:w="3744"/>
+          </w:tcPr>
+          <w:p>
+            <w:pPr>
+              <w:spacing w:after="0" w:before="0" w:line="240" w:lineRule="auto"/>
+            </w:pPr>
+            <w:r/>
+            <w:r>
+              <w:rPr>
+                <w:rFonts w:ascii="Times New Roman" w:hAnsi="Times New Roman" w:cs="Times New Roman" w:eastAsia="Times New Roman"/>
+                <w:b w:val="0"/>
+                <w:i w:val="0"/>
+                <w:color w:val="000000"/>
+                <w:sz w:val="18"/>
+              </w:rPr>
+              <w:t xml:space="preserve">    Aslamzai &amp; Saad</w:t>
+            </w:r>
+          </w:p>
+        </w:tc>
+        <w:tc>
+          <w:tcPr>
+            <w:tcW w:type="dxa" w:w="1584"/>
+          </w:tcPr>
+          <w:p>
+            <w:pPr>
+              <w:spacing w:after="0" w:before="0" w:line="240" w:lineRule="auto"/>
+            </w:pPr>
+            <w:r/>
+            <w:r>
+              <w:rPr>
+                <w:rFonts w:ascii="Times New Roman" w:hAnsi="Times New Roman" w:cs="Times New Roman" w:eastAsia="Times New Roman"/>
+                <w:b w:val="0"/>
+                <w:i w:val="0"/>
+                <w:color w:val="000000"/>
+                <w:sz w:val="18"/>
+              </w:rPr>
+            </w:r>
+          </w:p>
+        </w:tc>
+        <w:tc>
+          <w:tcPr>
+            <w:tcW w:type="dxa" w:w="1872"/>
+          </w:tcPr>
+          <w:p>
+            <w:pPr>
+              <w:spacing w:after="0" w:before="0" w:line="240" w:lineRule="auto"/>
+            </w:pPr>
+            <w:r/>
+            <w:r>
+              <w:rPr>
+                <w:rFonts w:ascii="Times New Roman" w:hAnsi="Times New Roman" w:cs="Times New Roman" w:eastAsia="Times New Roman"/>
+                <w:b w:val="0"/>
+                <w:i w:val="0"/>
+                <w:color w:val="000000"/>
+                <w:sz w:val="18"/>
+              </w:rPr>
+              <w:t>47.95%</w:t>
+            </w:r>
+          </w:p>
+        </w:tc>
+        <w:tc>
+          <w:tcPr>
+            <w:tcW w:type="dxa" w:w="1872"/>
+          </w:tcPr>
+          <w:p>
+            <w:pPr>
+              <w:spacing w:after="0" w:before="0" w:line="240" w:lineRule="auto"/>
+            </w:pPr>
+            <w:r/>
+            <w:r>
+              <w:rPr>
+                <w:rFonts w:ascii="Times New Roman" w:hAnsi="Times New Roman" w:cs="Times New Roman" w:eastAsia="Times New Roman"/>
+                <w:b w:val="0"/>
+                <w:i w:val="0"/>
+                <w:color w:val="000000"/>
+                <w:sz w:val="18"/>
+              </w:rPr>
+              <w:t>53.68%</w:t>
+            </w:r>
+          </w:p>
+        </w:tc>
+      </w:tr>
+      <w:tr>
+        <w:tc>
+          <w:tcPr>
+            <w:tcW w:type="dxa" w:w="3744"/>
+          </w:tcPr>
+          <w:p>
+            <w:pPr>
+              <w:spacing w:after="0" w:before="0" w:line="240" w:lineRule="auto"/>
+            </w:pPr>
+            <w:r/>
+            <w:r>
+              <w:rPr>
+                <w:rFonts w:ascii="Times New Roman" w:hAnsi="Times New Roman" w:cs="Times New Roman" w:eastAsia="Times New Roman"/>
+                <w:b w:val="0"/>
+                <w:i w:val="0"/>
+                <w:color w:val="000000"/>
+                <w:sz w:val="18"/>
+              </w:rPr>
+              <w:t>Our held-out set</w:t>
+            </w:r>
+          </w:p>
+        </w:tc>
+        <w:tc>
+          <w:tcPr>
+            <w:tcW w:type="dxa" w:w="1584"/>
+          </w:tcPr>
+          <w:p>
+            <w:pPr>
+              <w:spacing w:after="0" w:before="0" w:line="240" w:lineRule="auto"/>
+            </w:pPr>
+            <w:r/>
+            <w:r>
+              <w:rPr>
+                <w:rFonts w:ascii="Times New Roman" w:hAnsi="Times New Roman" w:cs="Times New Roman" w:eastAsia="Times New Roman"/>
+                <w:b w:val="0"/>
+                <w:i w:val="0"/>
+                <w:color w:val="000000"/>
+                <w:sz w:val="18"/>
+              </w:rPr>
+              <w:t>499</w:t>
+            </w:r>
+          </w:p>
+        </w:tc>
+        <w:tc>
+          <w:tcPr>
+            <w:tcW w:type="dxa" w:w="1872"/>
+          </w:tcPr>
+          <w:p>
+            <w:pPr>
+              <w:spacing w:after="0" w:before="0" w:line="240" w:lineRule="auto"/>
+            </w:pPr>
+            <w:r/>
+            <w:r>
+              <w:rPr>
+                <w:rFonts w:ascii="Times New Roman" w:hAnsi="Times New Roman" w:cs="Times New Roman" w:eastAsia="Times New Roman"/>
+                <w:b w:val="0"/>
+                <w:i w:val="0"/>
+                <w:color w:val="000000"/>
+                <w:sz w:val="18"/>
+              </w:rPr>
+              <w:t>71.34%</w:t>
+            </w:r>
+          </w:p>
+        </w:tc>
+        <w:tc>
+          <w:tcPr>
+            <w:tcW w:type="dxa" w:w="1872"/>
+          </w:tcPr>
+          <w:p>
+            <w:pPr>
+              <w:spacing w:after="0" w:before="0" w:line="240" w:lineRule="auto"/>
+            </w:pPr>
+            <w:r/>
+            <w:r>
+              <w:rPr>
+                <w:rFonts w:ascii="Times New Roman" w:hAnsi="Times New Roman" w:cs="Times New Roman" w:eastAsia="Times New Roman"/>
+                <w:b w:val="0"/>
+                <w:i w:val="0"/>
+                <w:color w:val="000000"/>
+                <w:sz w:val="18"/>
+              </w:rPr>
+              <w:t>72.14%</w:t>
+            </w:r>
+          </w:p>
+        </w:tc>
+      </w:tr>
+      <w:tr>
+        <w:tc>
+          <w:tcPr>
+            <w:tcW w:type="dxa" w:w="3744"/>
+          </w:tcPr>
+          <w:p>
+            <w:pPr>
+              <w:spacing w:after="0" w:before="0" w:line="240" w:lineRule="auto"/>
+            </w:pPr>
+            <w:r/>
+            <w:r>
+              <w:rPr>
+                <w:rFonts w:ascii="Times New Roman" w:hAnsi="Times New Roman" w:cs="Times New Roman" w:eastAsia="Times New Roman"/>
+                <w:b w:val="0"/>
+                <w:i w:val="0"/>
+                <w:color w:val="000000"/>
+                <w:sz w:val="18"/>
+              </w:rPr>
+              <w:t>Our development set</w:t>
+            </w:r>
+          </w:p>
+        </w:tc>
+        <w:tc>
+          <w:tcPr>
+            <w:tcW w:type="dxa" w:w="1584"/>
+          </w:tcPr>
+          <w:p>
+            <w:pPr>
+              <w:spacing w:after="0" w:before="0" w:line="240" w:lineRule="auto"/>
+            </w:pPr>
+            <w:r/>
+            <w:r>
+              <w:rPr>
+                <w:rFonts w:ascii="Times New Roman" w:hAnsi="Times New Roman" w:cs="Times New Roman" w:eastAsia="Times New Roman"/>
+                <w:b w:val="0"/>
+                <w:i w:val="0"/>
+                <w:color w:val="000000"/>
+                <w:sz w:val="18"/>
+              </w:rPr>
+              <w:t>2,717</w:t>
+            </w:r>
+          </w:p>
+        </w:tc>
+        <w:tc>
+          <w:tcPr>
+            <w:tcW w:type="dxa" w:w="1872"/>
+          </w:tcPr>
+          <w:p>
+            <w:pPr>
+              <w:spacing w:after="0" w:before="0" w:line="240" w:lineRule="auto"/>
+            </w:pPr>
+            <w:r/>
+            <w:r>
+              <w:rPr>
+                <w:rFonts w:ascii="Times New Roman" w:hAnsi="Times New Roman" w:cs="Times New Roman" w:eastAsia="Times New Roman"/>
+                <w:b w:val="0"/>
+                <w:i w:val="0"/>
+                <w:color w:val="000000"/>
+                <w:sz w:val="18"/>
+              </w:rPr>
+              <w:t>79.43%</w:t>
+            </w:r>
+          </w:p>
+        </w:tc>
+        <w:tc>
+          <w:tcPr>
+            <w:tcW w:type="dxa" w:w="1872"/>
+          </w:tcPr>
+          <w:p>
+            <w:pPr>
+              <w:spacing w:after="0" w:before="0" w:line="240" w:lineRule="auto"/>
+            </w:pPr>
+            <w:r/>
+            <w:r>
+              <w:rPr>
+                <w:rFonts w:ascii="Times New Roman" w:hAnsi="Times New Roman" w:cs="Times New Roman" w:eastAsia="Times New Roman"/>
+                <w:b w:val="0"/>
+                <w:i w:val="0"/>
+                <w:color w:val="000000"/>
+                <w:sz w:val="18"/>
+              </w:rPr>
+              <w:t>80.93%</w:t>
+            </w:r>
+          </w:p>
+        </w:tc>
+      </w:tr>
+    </w:tbl>
+    <w:p>
+      <w:pPr>
+        <w:spacing w:before="40" w:after="200"/>
+      </w:pPr>
+      <w:r>
+        <w:rPr>
+          <w:rFonts w:ascii="Times New Roman" w:hAnsi="Times New Roman" w:cs="Times New Roman" w:eastAsia="Times New Roman"/>
+          <w:b w:val="0"/>
+          <w:i/>
+          <w:color w:val="444444"/>
+          <w:sz w:val="17"/>
+        </w:rPr>
+        <w:t>The folded column compares with the five ye letters treated as equal; the stemmer's output is never rewritten.</w:t>
+      </w:r>
+    </w:p>
+    <w:p>
+      <w:pPr>
+        <w:sectPr>
+          <w:type w:val="continuous"/>
+          <w:pgSz w:w="12240" w:h="15840"/>
+          <w:pgMar w:top="1296" w:right="1224" w:bottom="1296" w:left="1224" w:header="720" w:footer="720" w:gutter="0"/>
+          <w:cols w:space="360" w:num="1"/>
+          <w:docGrid w:linePitch="360"/>
+        </w:sectPr>
+      </w:pPr>
+    </w:p>
+    <w:p>
+      <w:pPr>
+        <w:spacing w:after="120" w:before="0" w:line="259" w:lineRule="auto"/>
+        <w:jc w:val="both"/>
+      </w:pPr>
+      <w:r>
+        <w:rPr>
+          <w:rFonts w:ascii="Times New Roman" w:hAnsi="Times New Roman" w:cs="Times New Roman" w:eastAsia="Times New Roman"/>
+          <w:b w:val="0"/>
+          <w:i w:val="0"/>
+          <w:color w:val="000000"/>
+          <w:sz w:val="20"/>
+        </w:rPr>
+        <w:t xml:space="preserve">Both lists carry a reference column normalised to </w:t>
+      </w:r>
+      <w:r>
+        <w:rPr>
+          <w:rFonts w:ascii="Noto Naskh Arabic" w:hAnsi="Noto Naskh Arabic" w:cs="Noto Naskh Arabic" w:eastAsia="Noto Naskh Arabic"/>
+          <w:b w:val="0"/>
+          <w:i w:val="0"/>
+          <w:color w:val="000000"/>
+          <w:sz w:val="22"/>
+          <w:rtl w:val="1"/>
+        </w:rPr>
+        <w:t>ی</w:t>
+      </w:r>
+      <w:r>
+        <w:rPr>
+          <w:rFonts w:ascii="Times New Roman" w:hAnsi="Times New Roman" w:cs="Times New Roman" w:eastAsia="Times New Roman"/>
+          <w:b w:val="0"/>
+          <w:i w:val="0"/>
+          <w:color w:val="000000"/>
+          <w:sz w:val="2"/>
+        </w:rPr>
+        <w:t>‎</w:t>
+      </w:r>
+      <w:r>
+        <w:rPr>
+          <w:rFonts w:ascii="Times New Roman" w:hAnsi="Times New Roman" w:cs="Times New Roman" w:eastAsia="Times New Roman"/>
+          <w:b w:val="0"/>
+          <w:i w:val="0"/>
+          <w:color w:val="000000"/>
+          <w:sz w:val="20"/>
+        </w:rPr>
+        <w:t xml:space="preserve"> while their word column retains </w:t>
+      </w:r>
+      <w:r>
+        <w:rPr>
+          <w:rFonts w:ascii="Noto Naskh Arabic" w:hAnsi="Noto Naskh Arabic" w:cs="Noto Naskh Arabic" w:eastAsia="Noto Naskh Arabic"/>
+          <w:b w:val="0"/>
+          <w:i w:val="0"/>
+          <w:color w:val="000000"/>
+          <w:sz w:val="22"/>
+          <w:rtl w:val="1"/>
+        </w:rPr>
+        <w:t>ي</w:t>
+      </w:r>
+      <w:r>
+        <w:rPr>
+          <w:rFonts w:ascii="Times New Roman" w:hAnsi="Times New Roman" w:cs="Times New Roman" w:eastAsia="Times New Roman"/>
+          <w:b w:val="0"/>
+          <w:i w:val="0"/>
+          <w:color w:val="000000"/>
+          <w:sz w:val="2"/>
+        </w:rPr>
+        <w:t>‎</w:t>
+      </w:r>
+      <w:r>
+        <w:rPr>
+          <w:rFonts w:ascii="Times New Roman" w:hAnsi="Times New Roman" w:cs="Times New Roman" w:eastAsia="Times New Roman"/>
+          <w:b w:val="0"/>
+          <w:i w:val="0"/>
+          <w:color w:val="000000"/>
+          <w:sz w:val="20"/>
+        </w:rPr>
+        <w:t>, so a stem is scored wrong whenever it preserves the letter the word actually has. Folding the five ye letters together for the comparison alone raises the two figures to 80.14% and 77.69%. The same folded comparison is worth 1.51 points on our development set and 0.80 on our held-out set, both of which are internally consistent in their orthography. The size of that difference is what the measurement shows: seven to eight points on the external lists against one on ours places the disagreement in how they spell the reference rather than in the stemming.</w:t>
+      </w:r>
+    </w:p>
+    <w:p>
+      <w:pPr>
+        <w:spacing w:after="120" w:before="0" w:line="259" w:lineRule="auto"/>
+        <w:ind w:firstLine="259"/>
+        <w:jc w:val="both"/>
+      </w:pPr>
+      <w:r>
+        <w:rPr>
+          <w:rFonts w:ascii="Times New Roman" w:hAnsi="Times New Roman" w:cs="Times New Roman" w:eastAsia="Times New Roman"/>
+          <w:b w:val="0"/>
+          <w:i w:val="0"/>
+          <w:color w:val="000000"/>
+          <w:sz w:val="20"/>
+        </w:rPr>
+        <w:t xml:space="preserve">One caveat limits what these lists establish. On the words they share with our development set the two references agree 70.8% and 64.1% of the time, and the differences are systematic rather than scattered: </w:t>
+      </w:r>
+      <w:r>
+        <w:rPr>
+          <w:rFonts w:ascii="Noto Naskh Arabic" w:hAnsi="Noto Naskh Arabic" w:cs="Noto Naskh Arabic" w:eastAsia="Noto Naskh Arabic"/>
+          <w:b w:val="0"/>
+          <w:i w:val="0"/>
+          <w:color w:val="000000"/>
+          <w:sz w:val="22"/>
+          <w:rtl w:val="1"/>
+        </w:rPr>
+        <w:t>اخلی</w:t>
+      </w:r>
+      <w:r>
+        <w:rPr>
+          <w:rFonts w:ascii="Times New Roman" w:hAnsi="Times New Roman" w:cs="Times New Roman" w:eastAsia="Times New Roman"/>
+          <w:b w:val="0"/>
+          <w:i w:val="0"/>
+          <w:color w:val="000000"/>
+          <w:sz w:val="2"/>
+        </w:rPr>
+        <w:t>‎</w:t>
+      </w:r>
+      <w:r>
+        <w:rPr>
+          <w:rFonts w:ascii="Times New Roman" w:hAnsi="Times New Roman" w:cs="Times New Roman" w:eastAsia="Times New Roman"/>
+          <w:b w:val="0"/>
+          <w:i w:val="0"/>
+          <w:color w:val="000000"/>
+          <w:sz w:val="20"/>
+        </w:rPr>
+        <w:t xml:space="preserve"> is stemmed to </w:t>
+      </w:r>
+      <w:r>
+        <w:rPr>
+          <w:rFonts w:ascii="Noto Naskh Arabic" w:hAnsi="Noto Naskh Arabic" w:cs="Noto Naskh Arabic" w:eastAsia="Noto Naskh Arabic"/>
+          <w:b w:val="0"/>
+          <w:i w:val="0"/>
+          <w:color w:val="000000"/>
+          <w:sz w:val="22"/>
+          <w:rtl w:val="1"/>
+        </w:rPr>
+        <w:t>اخ</w:t>
+      </w:r>
+      <w:r>
+        <w:rPr>
+          <w:rFonts w:ascii="Times New Roman" w:hAnsi="Times New Roman" w:cs="Times New Roman" w:eastAsia="Times New Roman"/>
+          <w:b w:val="0"/>
+          <w:i w:val="0"/>
+          <w:color w:val="000000"/>
+          <w:sz w:val="2"/>
+        </w:rPr>
+        <w:t>‎</w:t>
+      </w:r>
+      <w:r>
+        <w:rPr>
+          <w:rFonts w:ascii="Times New Roman" w:hAnsi="Times New Roman" w:cs="Times New Roman" w:eastAsia="Times New Roman"/>
+          <w:b w:val="0"/>
+          <w:i w:val="0"/>
+          <w:color w:val="000000"/>
+          <w:sz w:val="20"/>
+        </w:rPr>
+        <w:t xml:space="preserve"> there and </w:t>
+      </w:r>
+      <w:r>
+        <w:rPr>
+          <w:rFonts w:ascii="Noto Naskh Arabic" w:hAnsi="Noto Naskh Arabic" w:cs="Noto Naskh Arabic" w:eastAsia="Noto Naskh Arabic"/>
+          <w:b w:val="0"/>
+          <w:i w:val="0"/>
+          <w:color w:val="000000"/>
+          <w:sz w:val="22"/>
+          <w:rtl w:val="1"/>
+        </w:rPr>
+        <w:t>اخیستل</w:t>
+      </w:r>
+      <w:r>
+        <w:rPr>
+          <w:rFonts w:ascii="Times New Roman" w:hAnsi="Times New Roman" w:cs="Times New Roman" w:eastAsia="Times New Roman"/>
+          <w:b w:val="0"/>
+          <w:i w:val="0"/>
+          <w:color w:val="000000"/>
+          <w:sz w:val="2"/>
+        </w:rPr>
+        <w:t>‎</w:t>
+      </w:r>
+      <w:r>
+        <w:rPr>
+          <w:rFonts w:ascii="Times New Roman" w:hAnsi="Times New Roman" w:cs="Times New Roman" w:eastAsia="Times New Roman"/>
+          <w:b w:val="0"/>
+          <w:i w:val="0"/>
+          <w:color w:val="000000"/>
+          <w:sz w:val="20"/>
+        </w:rPr>
+        <w:t xml:space="preserve"> here, </w:t>
+      </w:r>
+      <w:r>
+        <w:rPr>
+          <w:rFonts w:ascii="Noto Naskh Arabic" w:hAnsi="Noto Naskh Arabic" w:cs="Noto Naskh Arabic" w:eastAsia="Noto Naskh Arabic"/>
+          <w:b w:val="0"/>
+          <w:i w:val="0"/>
+          <w:color w:val="000000"/>
+          <w:sz w:val="22"/>
+          <w:rtl w:val="1"/>
+        </w:rPr>
+        <w:t>بدلولو</w:t>
+      </w:r>
+      <w:r>
+        <w:rPr>
+          <w:rFonts w:ascii="Times New Roman" w:hAnsi="Times New Roman" w:cs="Times New Roman" w:eastAsia="Times New Roman"/>
+          <w:b w:val="0"/>
+          <w:i w:val="0"/>
+          <w:color w:val="000000"/>
+          <w:sz w:val="2"/>
+        </w:rPr>
+        <w:t>‎</w:t>
+      </w:r>
+      <w:r>
+        <w:rPr>
+          <w:rFonts w:ascii="Times New Roman" w:hAnsi="Times New Roman" w:cs="Times New Roman" w:eastAsia="Times New Roman"/>
+          <w:b w:val="0"/>
+          <w:i w:val="0"/>
+          <w:color w:val="000000"/>
+          <w:sz w:val="20"/>
+        </w:rPr>
+        <w:t xml:space="preserve"> to </w:t>
+      </w:r>
+      <w:r>
+        <w:rPr>
+          <w:rFonts w:ascii="Noto Naskh Arabic" w:hAnsi="Noto Naskh Arabic" w:cs="Noto Naskh Arabic" w:eastAsia="Noto Naskh Arabic"/>
+          <w:b w:val="0"/>
+          <w:i w:val="0"/>
+          <w:color w:val="000000"/>
+          <w:sz w:val="22"/>
+          <w:rtl w:val="1"/>
+        </w:rPr>
+        <w:t>بدلول</w:t>
+      </w:r>
+      <w:r>
+        <w:rPr>
+          <w:rFonts w:ascii="Times New Roman" w:hAnsi="Times New Roman" w:cs="Times New Roman" w:eastAsia="Times New Roman"/>
+          <w:b w:val="0"/>
+          <w:i w:val="0"/>
+          <w:color w:val="000000"/>
+          <w:sz w:val="2"/>
+        </w:rPr>
+        <w:t>‎</w:t>
+      </w:r>
+      <w:r>
+        <w:rPr>
+          <w:rFonts w:ascii="Times New Roman" w:hAnsi="Times New Roman" w:cs="Times New Roman" w:eastAsia="Times New Roman"/>
+          <w:b w:val="0"/>
+          <w:i w:val="0"/>
+          <w:color w:val="000000"/>
+          <w:sz w:val="20"/>
+        </w:rPr>
+        <w:t xml:space="preserve"> rather than </w:t>
+      </w:r>
+      <w:r>
+        <w:rPr>
+          <w:rFonts w:ascii="Noto Naskh Arabic" w:hAnsi="Noto Naskh Arabic" w:cs="Noto Naskh Arabic" w:eastAsia="Noto Naskh Arabic"/>
+          <w:b w:val="0"/>
+          <w:i w:val="0"/>
+          <w:color w:val="000000"/>
+          <w:sz w:val="22"/>
+          <w:rtl w:val="1"/>
+        </w:rPr>
+        <w:t>بدل</w:t>
+      </w:r>
+      <w:r>
+        <w:rPr>
+          <w:rFonts w:ascii="Times New Roman" w:hAnsi="Times New Roman" w:cs="Times New Roman" w:eastAsia="Times New Roman"/>
+          <w:b w:val="0"/>
+          <w:i w:val="0"/>
+          <w:color w:val="000000"/>
+          <w:sz w:val="2"/>
+        </w:rPr>
+        <w:t>‎</w:t>
+      </w:r>
+      <w:r>
+        <w:rPr>
+          <w:rFonts w:ascii="Times New Roman" w:hAnsi="Times New Roman" w:cs="Times New Roman" w:eastAsia="Times New Roman"/>
+          <w:b w:val="0"/>
+          <w:i w:val="0"/>
+          <w:color w:val="000000"/>
+          <w:sz w:val="20"/>
+        </w:rPr>
+        <w:t>. They follow a different annotation policy, particularly for verbs, so they test whether the system generalises, not whether it is correct under ours.</w:t>
+      </w:r>
+    </w:p>
+    <w:p>
+      <w:pPr>
+        <w:keepNext/>
+        <w:spacing w:before="160" w:after="80"/>
+      </w:pPr>
+      <w:r>
+        <w:rPr>
+          <w:rFonts w:ascii="Times New Roman" w:hAnsi="Times New Roman" w:cs="Times New Roman" w:eastAsia="Times New Roman"/>
+          <w:b/>
+          <w:i/>
+          <w:color w:val="000000"/>
+          <w:sz w:val="20"/>
+        </w:rPr>
+        <w:t>D. Component study</w:t>
+      </w:r>
+    </w:p>
+    <w:p>
+      <w:pPr>
+        <w:sectPr>
+          <w:type w:val="continuous"/>
+          <w:pgSz w:w="12240" w:h="15840"/>
+          <w:pgMar w:top="1296" w:right="1224" w:bottom="1296" w:left="1224" w:header="720" w:footer="720" w:gutter="0"/>
+          <w:cols w:space="360" w:num="2"/>
+          <w:docGrid w:linePitch="360"/>
+        </w:sectPr>
+      </w:pPr>
+    </w:p>
+    <w:p>
+      <w:pPr>
+        <w:spacing w:before="200" w:after="60"/>
+        <w:jc w:val="left"/>
+      </w:pPr>
+      <w:r>
+        <w:rPr>
+          <w:rFonts w:ascii="Times New Roman" w:hAnsi="Times New Roman" w:cs="Times New Roman" w:eastAsia="Times New Roman"/>
+          <w:b/>
+          <w:i w:val="0"/>
+          <w:color w:val="000000"/>
+          <w:sz w:val="18"/>
+        </w:rPr>
+        <w:t>TABLE X.  EACH COMPONENT REMOVED IN TURN</w:t>
       </w:r>
     </w:p>
     <w:tbl>
@@ -11392,7 +12382,7 @@
           <w:color w:val="000000"/>
           <w:sz w:val="20"/>
         </w:rPr>
-        <w:t>D. Orthography</w:t>
+        <w:t>E. Orthography</w:t>
       </w:r>
     </w:p>
     <w:p>

</xml_diff>